<commit_message>
W7 materials updated Oct 13th 2027
</commit_message>
<xml_diff>
--- a/lectures/week07/Week7_Lecture.docx
+++ b/lectures/week07/Week7_Lecture.docx
@@ -395,7 +395,7 @@
           <w:sz w:val="22"/>
           <w:szCs w:val="22"/>
         </w:rPr>
-        <w:t xml:space="preserve">·  van Beers, R. J., Haggard, P., &amp; Wolpert, D. M. (2004). The role of execution noise in movement variability. Journal of Neurophysiology, 91, 1050–1063. — Measures endpoint variability in people on a task like ours and models it with three kinds of noise on the motor commands: signal-dependent, fixed-size and timing noise. None of the three alone fits. §1, §2.4 and §3.4 use it.</w:t>
+        <w:t xml:space="preserve">·  van Beers, R. J., Haggard, P., &amp; Wolpert, D. M. (2004). The role of execution noise in movement variability. Journal of Neurophysiology, 91, 1050–1063. — Measures endpoint variability in people on a task like ours and models it with three kinds of noise on the motor commands: signal-dependent, fixed-size and timing noise. None of the three alone fits. §1, §2.4 and §3.4 use it, and §7 its evidence for proprioceptive corrections.</w:t>
       </w:r>
     </w:p>
     <w:p>
@@ -576,6 +576,26 @@
           <w:szCs w:val="22"/>
         </w:rPr>
         <w:t xml:space="preserve">·  Keele, S. W., &amp; Posner, M. I. (1968). Processing of visual feedback in rapid movements. Journal of Experimental Psychology, 77, 155–158. — How long visual feedback takes; Week 8’s reading; §7.3.</w:t>
+      </w:r>
+    </w:p>
+    <w:p>
+      <w:pPr>
+        <w:spacing w:after="100" w:line="276"/>
+        <w:ind w:left="504" w:hanging="259"/>
+      </w:pPr>
+      <w:r>
+        <w:rPr>
+          <w:rFonts w:ascii="Cambria" w:cs="Cambria" w:eastAsia="Cambria" w:hAnsi="Cambria"/>
+          <w:b w:val="false"/>
+          <w:bCs w:val="false"/>
+          <w:i w:val="false"/>
+          <w:iCs w:val="false"/>
+          <w:caps w:val="false"/>
+          <w:color w:val="666666"/>
+          <w:sz w:val="22"/>
+          <w:szCs w:val="22"/>
+        </w:rPr>
+        <w:t xml:space="preserve">·  Zelaznik, H. N., Hawkins, B., &amp; Kisselburgh, L. (1983). Rapid visual feedback processing in single-aiming movements. Journal of Motor Behavior, 15, 217–236. — Vision helps movements as short as 120 ms; §7.3 and Week 8.</w:t>
       </w:r>
     </w:p>
     <w:p>
@@ -4877,7 +4897,36 @@
                 <w:sz w:val="21"/>
                 <w:szCs w:val="21"/>
               </w:rPr>
-              <w:t xml:space="preserve">τ_exec(t) is what the arm receives. The simulation passes it to Week 3’s forward dynamics, q̈ = M(q)⁻¹[τ_exec(t) − c(q, q̇)], evaluated at the arm’s actual joint angles and velocities, and integrates the result. ξ(t) is drawn afresh on every trial, so τ_exec(t) and the path of the hand differ from trial to trial.</w:t>
+              <w:t xml:space="preserve">τ_exec(t) is what the arm receives. The simulation passes it to Week 3’s forward dynamics, q̈ = M(q)</w:t>
+            </w:r>
+            <w:r>
+              <w:rPr>
+                <w:rFonts w:ascii="Cambria" w:cs="Cambria" w:eastAsia="Cambria" w:hAnsi="Cambria"/>
+                <w:b w:val="false"/>
+                <w:bCs w:val="false"/>
+                <w:i w:val="false"/>
+                <w:iCs w:val="false"/>
+                <w:caps w:val="false"/>
+                <w:color w:val="333333"/>
+                <w:sz w:val="21"/>
+                <w:szCs w:val="21"/>
+                <w:vertAlign w:val="superscript"/>
+              </w:rPr>
+              <w:t xml:space="preserve">−1</w:t>
+            </w:r>
+            <w:r>
+              <w:rPr>
+                <w:rFonts w:ascii="Cambria" w:cs="Cambria" w:eastAsia="Cambria" w:hAnsi="Cambria"/>
+                <w:b w:val="false"/>
+                <w:bCs w:val="false"/>
+                <w:i w:val="false"/>
+                <w:iCs w:val="false"/>
+                <w:caps w:val="false"/>
+                <w:color w:val="333333"/>
+                <w:sz w:val="21"/>
+                <w:szCs w:val="21"/>
+              </w:rPr>
+              <w:t xml:space="preserve">[τ_exec(t) − c(q, q̇)], evaluated at the arm’s actual joint angles and velocities, and integrates the result. ξ(t) is drawn afresh on every trial, so τ_exec(t) and the path of the hand differ from trial to trial.</w:t>
             </w:r>
           </w:p>
         </w:tc>
@@ -9770,6 +9819,80 @@
             <w:tcMar>
               <w:top w:type="dxa" w:w="0"/>
               <w:left w:type="dxa" w:w="200"/>
+              <w:bottom w:type="dxa" w:w="90"/>
+              <w:right w:type="dxa" w:w="200"/>
+            </w:tcMar>
+          </w:tcPr>
+          <w:p>
+            <w:pPr>
+              <w:keepNext w:val="false"/>
+              <w:spacing w:after="0" w:line="276"/>
+            </w:pPr>
+            <w:r>
+              <w:rPr>
+                <w:rFonts w:ascii="Cambria" w:cs="Cambria" w:eastAsia="Cambria" w:hAnsi="Cambria"/>
+                <w:b w:val="false"/>
+                <w:bCs w:val="false"/>
+                <w:i w:val="false"/>
+                <w:iCs w:val="false"/>
+                <w:caps w:val="false"/>
+                <w:color w:val="333333"/>
+                <w:sz w:val="21"/>
+                <w:szCs w:val="21"/>
+              </w:rPr>
+              <w:t xml:space="preserve">The same steps at 12 cm give that column: 0.669 cm and 3.30 bits with signal-dependent noise, 0.444 cm and 3.80 bits with fixed-size noise. Why one row of bits stays put while the other rises is clearest for one direction, the 135° reach.</w:t>
+            </w:r>
+          </w:p>
+        </w:tc>
+      </w:tr>
+      <w:tr>
+        <w:trPr>
+          <w:cantSplit/>
+        </w:trPr>
+        <w:tc>
+          <w:tcPr>
+            <w:tcW w:type="dxa" w:w="9360"/>
+            <w:shd w:fill="E8F1F8" w:color="auto" w:val="clear"/>
+            <w:tcMar>
+              <w:top w:type="dxa" w:w="0"/>
+              <w:left w:type="dxa" w:w="200"/>
+              <w:bottom w:type="dxa" w:w="90"/>
+              <w:right w:type="dxa" w:w="200"/>
+            </w:tcMar>
+          </w:tcPr>
+          <w:p>
+            <w:pPr>
+              <w:keepNext w:val="false"/>
+              <w:spacing w:after="0" w:line="276"/>
+            </w:pPr>
+            <w:r>
+              <w:rPr>
+                <w:rFonts w:ascii="Cambria" w:cs="Cambria" w:eastAsia="Cambria" w:hAnsi="Cambria"/>
+                <w:b w:val="false"/>
+                <w:bCs w:val="false"/>
+                <w:i w:val="false"/>
+                <w:iCs w:val="false"/>
+                <w:caps w:val="false"/>
+                <w:color w:val="333333"/>
+                <w:sz w:val="21"/>
+                <w:szCs w:val="21"/>
+              </w:rPr>
+              <w:t xml:space="preserve">From 3 to 12 cm the distance is four times larger, so 2D grows from 60 to 240 mm. With signal-dependent noise the command is also four times larger, so the SD grows fourfold, from 0.178 to 0.714 cm, and so does the smallest target, from 6.74 to 26.98 mm. The ratio 2D/W is unchanged, 60/6.74 = 240/26.98 = 8.90, so the bits are unchanged: 3.15 at both distances.</w:t>
+            </w:r>
+          </w:p>
+        </w:tc>
+      </w:tr>
+      <w:tr>
+        <w:trPr>
+          <w:cantSplit/>
+        </w:trPr>
+        <w:tc>
+          <w:tcPr>
+            <w:tcW w:type="dxa" w:w="9360"/>
+            <w:shd w:fill="E8F1F8" w:color="auto" w:val="clear"/>
+            <w:tcMar>
+              <w:top w:type="dxa" w:w="0"/>
+              <w:left w:type="dxa" w:w="200"/>
               <w:bottom w:type="dxa" w:w="150"/>
               <w:right w:type="dxa" w:w="200"/>
             </w:tcMar>
@@ -9791,7 +9914,7 @@
                 <w:sz w:val="21"/>
                 <w:szCs w:val="21"/>
               </w:rPr>
-              <w:t xml:space="preserve">The same steps at 12 cm give that column: 0.669 cm and 3.30 bits with signal-dependent noise, 0.444 cm and 3.80 bits with fixed-size noise. With signal-dependent noise the SD is 4.0 times larger and the bits are the same. With fixed-size noise the SD is the same, 2D is four times larger, and the bits rise by 2.0.</w:t>
+              <w:t xml:space="preserve">With fixed-size noise the SD stays near 0.45 cm and the smallest target near 17.8 mm at both distances. Only 2D changes, so 2D/W grows fourfold, from about 3.4 to about 13.5, and the bits rise by log₂ 4 = 2: from 1.76 to 3.76 for this reach.</w:t>
             </w:r>
           </w:p>
         </w:tc>
@@ -9979,7 +10102,36 @@
           <w:sz w:val="22"/>
           <w:szCs w:val="22"/>
         </w:rPr>
-        <w:t xml:space="preserve">Week 3 §3 derived the mass matrix M(q) from the kinetic energy of the arm. For a single joint, acceleration is torque divided by inertia. For the two-link arm the division becomes a matrix inverse, q̈ = M⁻¹τ. Week 3’s Figure 5 plotted this quantity.</w:t>
+        <w:t xml:space="preserve">Week 3 §3 derived the mass matrix M(q) from the kinetic energy of the arm. For a single joint, acceleration is torque divided by inertia. For the two-link arm the division becomes a matrix inverse, q̈ = M</w:t>
+      </w:r>
+      <w:r>
+        <w:rPr>
+          <w:rFonts w:ascii="Cambria" w:cs="Cambria" w:eastAsia="Cambria" w:hAnsi="Cambria"/>
+          <w:b w:val="false"/>
+          <w:bCs w:val="false"/>
+          <w:i w:val="false"/>
+          <w:iCs w:val="false"/>
+          <w:caps w:val="false"/>
+          <w:color w:val="333333"/>
+          <w:sz w:val="22"/>
+          <w:szCs w:val="22"/>
+          <w:vertAlign w:val="superscript"/>
+        </w:rPr>
+        <w:t xml:space="preserve">−1</w:t>
+      </w:r>
+      <w:r>
+        <w:rPr>
+          <w:rFonts w:ascii="Cambria" w:cs="Cambria" w:eastAsia="Cambria" w:hAnsi="Cambria"/>
+          <w:b w:val="false"/>
+          <w:bCs w:val="false"/>
+          <w:i w:val="false"/>
+          <w:iCs w:val="false"/>
+          <w:caps w:val="false"/>
+          <w:color w:val="333333"/>
+          <w:sz w:val="22"/>
+          <w:szCs w:val="22"/>
+        </w:rPr>
+        <w:t xml:space="preserve">τ. Week 3’s Figure 5 plotted this quantity.</w:t>
       </w:r>
     </w:p>
     <w:p>
@@ -10042,7 +10194,36 @@
           <w:sz w:val="24"/>
           <w:szCs w:val="24"/>
         </w:rPr>
-        <w:t xml:space="preserve">δp̈  =  J(q) · M(q)⁻¹ · δτ</w:t>
+        <w:t xml:space="preserve">δp̈  =  J(q) · M(q)</w:t>
+      </w:r>
+      <w:r>
+        <w:rPr>
+          <w:rFonts w:ascii="Cambria" w:cs="Cambria" w:eastAsia="Cambria" w:hAnsi="Cambria"/>
+          <w:b w:val="false"/>
+          <w:bCs w:val="false"/>
+          <w:i w:val="false"/>
+          <w:iCs w:val="false"/>
+          <w:caps w:val="false"/>
+          <w:color w:val="333333"/>
+          <w:sz w:val="24"/>
+          <w:szCs w:val="24"/>
+          <w:vertAlign w:val="superscript"/>
+        </w:rPr>
+        <w:t xml:space="preserve">−1</w:t>
+      </w:r>
+      <w:r>
+        <w:rPr>
+          <w:rFonts w:ascii="Cambria" w:cs="Cambria" w:eastAsia="Cambria" w:hAnsi="Cambria"/>
+          <w:b w:val="false"/>
+          <w:bCs w:val="false"/>
+          <w:i w:val="false"/>
+          <w:iCs w:val="false"/>
+          <w:caps w:val="false"/>
+          <w:color w:val="333333"/>
+          <w:sz w:val="24"/>
+          <w:szCs w:val="24"/>
+        </w:rPr>
+        <w:t xml:space="preserve"> · δτ</w:t>
       </w:r>
       <w:r>
         <w:rPr>
@@ -10072,7 +10253,36 @@
           <w:sz w:val="22"/>
           <w:szCs w:val="22"/>
         </w:rPr>
-        <w:t xml:space="preserve">In the terms of the Introduction, the product G(q) = J M⁻¹ is the channel: it carries any joint torque, whether commanded or noise, to the hand as an acceleration. G is a 2 × 2 matrix that depends on the posture of the arm, and both of its factors were built in earlier weeks.</w:t>
+        <w:t xml:space="preserve">In the terms of the Introduction, the product G(q) = J M</w:t>
+      </w:r>
+      <w:r>
+        <w:rPr>
+          <w:rFonts w:ascii="Cambria" w:cs="Cambria" w:eastAsia="Cambria" w:hAnsi="Cambria"/>
+          <w:b w:val="false"/>
+          <w:bCs w:val="false"/>
+          <w:i w:val="false"/>
+          <w:iCs w:val="false"/>
+          <w:caps w:val="false"/>
+          <w:color w:val="333333"/>
+          <w:sz w:val="22"/>
+          <w:szCs w:val="22"/>
+          <w:vertAlign w:val="superscript"/>
+        </w:rPr>
+        <w:t xml:space="preserve">−1</w:t>
+      </w:r>
+      <w:r>
+        <w:rPr>
+          <w:rFonts w:ascii="Cambria" w:cs="Cambria" w:eastAsia="Cambria" w:hAnsi="Cambria"/>
+          <w:b w:val="false"/>
+          <w:bCs w:val="false"/>
+          <w:i w:val="false"/>
+          <w:iCs w:val="false"/>
+          <w:caps w:val="false"/>
+          <w:color w:val="333333"/>
+          <w:sz w:val="22"/>
+          <w:szCs w:val="22"/>
+        </w:rPr>
+        <w:t xml:space="preserve"> is the channel: it carries any joint torque, whether commanded or noise, to the hand as an acceleration. G is a 2 × 2 matrix that depends on the posture of the arm, and both of its factors were built in earlier weeks.</w:t>
       </w:r>
     </w:p>
     <w:p>
@@ -10913,7 +11123,7 @@
           </w:tcPr>
           <w:p>
             <w:pPr>
-              <w:keepNext/>
+              <w:keepNext w:val="false"/>
               <w:spacing w:after="0"/>
             </w:pPr>
             <w:r>
@@ -10945,7 +11155,7 @@
           </w:tcPr>
           <w:p>
             <w:pPr>
-              <w:keepNext/>
+              <w:keepNext w:val="false"/>
               <w:spacing w:after="0"/>
             </w:pPr>
             <w:r>
@@ -10977,7 +11187,7 @@
           </w:tcPr>
           <w:p>
             <w:pPr>
-              <w:keepNext/>
+              <w:keepNext w:val="false"/>
               <w:spacing w:after="0"/>
             </w:pPr>
             <w:r>
@@ -11009,7 +11219,7 @@
           </w:tcPr>
           <w:p>
             <w:pPr>
-              <w:keepNext/>
+              <w:keepNext w:val="false"/>
               <w:spacing w:after="0"/>
             </w:pPr>
             <w:r>
@@ -11041,7 +11251,7 @@
           </w:tcPr>
           <w:p>
             <w:pPr>
-              <w:keepNext/>
+              <w:keepNext w:val="false"/>
               <w:spacing w:after="0"/>
             </w:pPr>
             <w:r>
@@ -11073,7 +11283,7 @@
           </w:tcPr>
           <w:p>
             <w:pPr>
-              <w:keepNext/>
+              <w:keepNext w:val="false"/>
               <w:spacing w:after="0"/>
             </w:pPr>
             <w:r>
@@ -11105,7 +11315,7 @@
           </w:tcPr>
           <w:p>
             <w:pPr>
-              <w:keepNext/>
+              <w:keepNext w:val="false"/>
               <w:spacing w:after="0"/>
             </w:pPr>
             <w:r>
@@ -11373,7 +11583,7 @@
           </w:tcPr>
           <w:p>
             <w:pPr>
-              <w:keepNext/>
+              <w:keepNext w:val="false"/>
               <w:spacing w:after="0"/>
             </w:pPr>
             <w:r>
@@ -11405,7 +11615,7 @@
           </w:tcPr>
           <w:p>
             <w:pPr>
-              <w:keepNext/>
+              <w:keepNext w:val="false"/>
               <w:spacing w:after="0"/>
             </w:pPr>
             <w:r>
@@ -11437,7 +11647,7 @@
           </w:tcPr>
           <w:p>
             <w:pPr>
-              <w:keepNext/>
+              <w:keepNext w:val="false"/>
               <w:spacing w:after="0"/>
             </w:pPr>
             <w:r>
@@ -11469,7 +11679,7 @@
           </w:tcPr>
           <w:p>
             <w:pPr>
-              <w:keepNext/>
+              <w:keepNext w:val="false"/>
               <w:spacing w:after="0"/>
             </w:pPr>
             <w:r>
@@ -11501,7 +11711,7 @@
           </w:tcPr>
           <w:p>
             <w:pPr>
-              <w:keepNext/>
+              <w:keepNext w:val="false"/>
               <w:spacing w:after="0"/>
             </w:pPr>
             <w:r>
@@ -11533,7 +11743,7 @@
           </w:tcPr>
           <w:p>
             <w:pPr>
-              <w:keepNext/>
+              <w:keepNext w:val="false"/>
               <w:spacing w:after="0"/>
             </w:pPr>
             <w:r>
@@ -11565,7 +11775,7 @@
           </w:tcPr>
           <w:p>
             <w:pPr>
-              <w:keepNext/>
+              <w:keepNext w:val="false"/>
               <w:spacing w:after="0"/>
             </w:pPr>
             <w:r>
@@ -11833,7 +12043,7 @@
           </w:tcPr>
           <w:p>
             <w:pPr>
-              <w:keepNext/>
+              <w:keepNext w:val="false"/>
               <w:spacing w:after="0"/>
             </w:pPr>
             <w:r>
@@ -11865,7 +12075,7 @@
           </w:tcPr>
           <w:p>
             <w:pPr>
-              <w:keepNext/>
+              <w:keepNext w:val="false"/>
               <w:spacing w:after="0"/>
             </w:pPr>
             <w:r>
@@ -11897,7 +12107,7 @@
           </w:tcPr>
           <w:p>
             <w:pPr>
-              <w:keepNext/>
+              <w:keepNext w:val="false"/>
               <w:spacing w:after="0"/>
             </w:pPr>
             <w:r>
@@ -11929,7 +12139,7 @@
           </w:tcPr>
           <w:p>
             <w:pPr>
-              <w:keepNext/>
+              <w:keepNext w:val="false"/>
               <w:spacing w:after="0"/>
             </w:pPr>
             <w:r>
@@ -11961,7 +12171,7 @@
           </w:tcPr>
           <w:p>
             <w:pPr>
-              <w:keepNext/>
+              <w:keepNext w:val="false"/>
               <w:spacing w:after="0"/>
             </w:pPr>
             <w:r>
@@ -11993,7 +12203,7 @@
           </w:tcPr>
           <w:p>
             <w:pPr>
-              <w:keepNext/>
+              <w:keepNext w:val="false"/>
               <w:spacing w:after="0"/>
             </w:pPr>
             <w:r>
@@ -12025,7 +12235,7 @@
           </w:tcPr>
           <w:p>
             <w:pPr>
-              <w:keepNext/>
+              <w:keepNext w:val="false"/>
               <w:spacing w:after="0"/>
             </w:pPr>
             <w:r>
@@ -12528,7 +12738,36 @@
           <w:sz w:val="22"/>
           <w:szCs w:val="22"/>
         </w:rPr>
-        <w:t xml:space="preserve">Figure 4A draws both sets of ellipses. The prediction gets the orientation of the scatter right to within 7.2° on average, the aspect ratio with r = 0.994 (Figure 4B), and the overall size to within 3%. The endpoint clouds are elongated, with aspect ratios (long axis divided by short axis) from 1.4 to 7.6. Equation 7.8 shows that this elongation comes from the geometry of the arm, through J M⁻¹.</w:t>
+        <w:t xml:space="preserve">Figure 4A draws both sets of ellipses. The prediction gets the orientation of the scatter right to within 7.2° on average, the aspect ratio with r = 0.994 (Figure 4B), and the overall size to within 3%. The endpoint clouds are elongated, with aspect ratios (long axis divided by short axis) from 1.4 to 7.6. Equation 7.8 shows that this elongation comes from the geometry of the arm, through J M</w:t>
+      </w:r>
+      <w:r>
+        <w:rPr>
+          <w:rFonts w:ascii="Cambria" w:cs="Cambria" w:eastAsia="Cambria" w:hAnsi="Cambria"/>
+          <w:b w:val="false"/>
+          <w:bCs w:val="false"/>
+          <w:i w:val="false"/>
+          <w:iCs w:val="false"/>
+          <w:caps w:val="false"/>
+          <w:color w:val="333333"/>
+          <w:sz w:val="22"/>
+          <w:szCs w:val="22"/>
+          <w:vertAlign w:val="superscript"/>
+        </w:rPr>
+        <w:t xml:space="preserve">−1</w:t>
+      </w:r>
+      <w:r>
+        <w:rPr>
+          <w:rFonts w:ascii="Cambria" w:cs="Cambria" w:eastAsia="Cambria" w:hAnsi="Cambria"/>
+          <w:b w:val="false"/>
+          <w:bCs w:val="false"/>
+          <w:i w:val="false"/>
+          <w:iCs w:val="false"/>
+          <w:caps w:val="false"/>
+          <w:color w:val="333333"/>
+          <w:sz w:val="22"/>
+          <w:szCs w:val="22"/>
+        </w:rPr>
+        <w:t xml:space="preserve">.</w:t>
       </w:r>
     </w:p>
     <w:p>
@@ -12712,7 +12951,65 @@
                 <w:sz w:val="21"/>
                 <w:szCs w:val="21"/>
               </w:rPr>
-              <w:t xml:space="preserve">With signal-dependent noise, δτ is proportional to |⁠τ|. In a reach dominated by inertia the command itself is τ ≈ M q̈. Substituting into Equation 7.7 gives J M⁻¹ δτ ∝ J M⁻¹ M q̈ = J q̈ = p̈.</w:t>
+              <w:t xml:space="preserve">With signal-dependent noise, δτ is proportional to |⁠τ|. In a reach dominated by inertia the command itself is τ ≈ M q̈. Substituting into Equation 7.7 gives J M</w:t>
+            </w:r>
+            <w:r>
+              <w:rPr>
+                <w:rFonts w:ascii="Cambria" w:cs="Cambria" w:eastAsia="Cambria" w:hAnsi="Cambria"/>
+                <w:b w:val="false"/>
+                <w:bCs w:val="false"/>
+                <w:i w:val="false"/>
+                <w:iCs w:val="false"/>
+                <w:caps w:val="false"/>
+                <w:color w:val="333333"/>
+                <w:sz w:val="21"/>
+                <w:szCs w:val="21"/>
+                <w:vertAlign w:val="superscript"/>
+              </w:rPr>
+              <w:t xml:space="preserve">−1</w:t>
+            </w:r>
+            <w:r>
+              <w:rPr>
+                <w:rFonts w:ascii="Cambria" w:cs="Cambria" w:eastAsia="Cambria" w:hAnsi="Cambria"/>
+                <w:b w:val="false"/>
+                <w:bCs w:val="false"/>
+                <w:i w:val="false"/>
+                <w:iCs w:val="false"/>
+                <w:caps w:val="false"/>
+                <w:color w:val="333333"/>
+                <w:sz w:val="21"/>
+                <w:szCs w:val="21"/>
+              </w:rPr>
+              <w:t xml:space="preserve"> δτ ∝ J M</w:t>
+            </w:r>
+            <w:r>
+              <w:rPr>
+                <w:rFonts w:ascii="Cambria" w:cs="Cambria" w:eastAsia="Cambria" w:hAnsi="Cambria"/>
+                <w:b w:val="false"/>
+                <w:bCs w:val="false"/>
+                <w:i w:val="false"/>
+                <w:iCs w:val="false"/>
+                <w:caps w:val="false"/>
+                <w:color w:val="333333"/>
+                <w:sz w:val="21"/>
+                <w:szCs w:val="21"/>
+                <w:vertAlign w:val="superscript"/>
+              </w:rPr>
+              <w:t xml:space="preserve">−1</w:t>
+            </w:r>
+            <w:r>
+              <w:rPr>
+                <w:rFonts w:ascii="Cambria" w:cs="Cambria" w:eastAsia="Cambria" w:hAnsi="Cambria"/>
+                <w:b w:val="false"/>
+                <w:bCs w:val="false"/>
+                <w:i w:val="false"/>
+                <w:iCs w:val="false"/>
+                <w:caps w:val="false"/>
+                <w:color w:val="333333"/>
+                <w:sz w:val="21"/>
+                <w:szCs w:val="21"/>
+              </w:rPr>
+              <w:t xml:space="preserve"> M q̈ = J q̈ = p̈.</w:t>
             </w:r>
           </w:p>
         </w:tc>
@@ -12879,7 +13176,7 @@
     </w:p>
     <w:p>
       <w:pPr>
-        <w:keepNext/>
+        <w:keepNext w:val="false"/>
         <w:spacing w:after="140" w:before="0" w:line="276"/>
       </w:pPr>
       <w:r>
@@ -12894,1527 +13191,8 @@
           <w:sz w:val="22"/>
           <w:szCs w:val="22"/>
         </w:rPr>
-        <w:t xml:space="preserve">Week 1 §4.2 noted that signal-dependent noise should matter near singularities. The channel lets us check what happens. We evaluate G = J M⁻¹ at postures with the elbow increasingly straight and apply torque noise of equal size at both joints. We then split the resulting hand acceleration into a radial component, along the line from shoulder to hand, and a tangential component across it:</w:t>
-      </w:r>
-    </w:p>
-    <w:tbl>
-      <w:tblPr>
-        <w:tblW w:type="dxa" w:w="9360"/>
-        <w:tblBorders>
-          <w:top w:val="single" w:color="auto" w:sz="4"/>
-          <w:left w:val="single" w:color="auto" w:sz="4"/>
-          <w:bottom w:val="single" w:color="auto" w:sz="4"/>
-          <w:right w:val="single" w:color="auto" w:sz="4"/>
-          <w:insideH w:val="single" w:color="auto" w:sz="4"/>
-          <w:insideV w:val="single" w:color="auto" w:sz="4"/>
-        </w:tblBorders>
-      </w:tblPr>
-      <w:tblGrid>
-        <w:gridCol w:w="1900"/>
-        <w:gridCol w:w="1800"/>
-        <w:gridCol w:w="1900"/>
-        <w:gridCol w:w="1900"/>
-        <w:gridCol w:w="1860"/>
-      </w:tblGrid>
-      <w:tr>
-        <w:trPr>
-          <w:cantSplit/>
-          <w:tblHeader/>
-        </w:trPr>
-        <w:tc>
-          <w:tcPr>
-            <w:tcW w:type="dxa" w:w="1900"/>
-            <w:shd w:fill="1B2A4A" w:color="auto" w:val="clear"/>
-            <w:tcMar>
-              <w:top w:type="dxa" w:w="70"/>
-              <w:left w:type="dxa" w:w="100"/>
-              <w:bottom w:type="dxa" w:w="70"/>
-              <w:right w:type="dxa" w:w="100"/>
-            </w:tcMar>
-          </w:tcPr>
-          <w:p>
-            <w:pPr>
-              <w:keepNext/>
-              <w:spacing w:after="0"/>
-            </w:pPr>
-            <w:r>
-              <w:rPr>
-                <w:rFonts w:ascii="Cambria" w:cs="Cambria" w:eastAsia="Cambria" w:hAnsi="Cambria"/>
-                <w:b/>
-                <w:bCs/>
-                <w:i w:val="false"/>
-                <w:iCs w:val="false"/>
-                <w:caps w:val="false"/>
-                <w:color w:val="FFFFFF"/>
-                <w:sz w:val="20"/>
-                <w:szCs w:val="20"/>
-              </w:rPr>
-              <w:t xml:space="preserve">elbow angle θ₂</w:t>
-            </w:r>
-          </w:p>
-        </w:tc>
-        <w:tc>
-          <w:tcPr>
-            <w:tcW w:type="dxa" w:w="1800"/>
-            <w:shd w:fill="1B2A4A" w:color="auto" w:val="clear"/>
-            <w:tcMar>
-              <w:top w:type="dxa" w:w="70"/>
-              <w:left w:type="dxa" w:w="100"/>
-              <w:bottom w:type="dxa" w:w="70"/>
-              <w:right w:type="dxa" w:w="100"/>
-            </w:tcMar>
-          </w:tcPr>
-          <w:p>
-            <w:pPr>
-              <w:keepNext/>
-              <w:spacing w:after="0"/>
-            </w:pPr>
-            <w:r>
-              <w:rPr>
-                <w:rFonts w:ascii="Cambria" w:cs="Cambria" w:eastAsia="Cambria" w:hAnsi="Cambria"/>
-                <w:b/>
-                <w:bCs/>
-                <w:i w:val="false"/>
-                <w:iCs w:val="false"/>
-                <w:caps w:val="false"/>
-                <w:color w:val="FFFFFF"/>
-                <w:sz w:val="20"/>
-                <w:szCs w:val="20"/>
-              </w:rPr>
-              <w:t xml:space="preserve">det(J)</w:t>
-            </w:r>
-          </w:p>
-        </w:tc>
-        <w:tc>
-          <w:tcPr>
-            <w:tcW w:type="dxa" w:w="1900"/>
-            <w:shd w:fill="1B2A4A" w:color="auto" w:val="clear"/>
-            <w:tcMar>
-              <w:top w:type="dxa" w:w="70"/>
-              <w:left w:type="dxa" w:w="100"/>
-              <w:bottom w:type="dxa" w:w="70"/>
-              <w:right w:type="dxa" w:w="100"/>
-            </w:tcMar>
-          </w:tcPr>
-          <w:p>
-            <w:pPr>
-              <w:keepNext/>
-              <w:spacing w:after="0"/>
-            </w:pPr>
-            <w:r>
-              <w:rPr>
-                <w:rFonts w:ascii="Cambria" w:cs="Cambria" w:eastAsia="Cambria" w:hAnsi="Cambria"/>
-                <w:b/>
-                <w:bCs/>
-                <w:i w:val="false"/>
-                <w:iCs w:val="false"/>
-                <w:caps w:val="false"/>
-                <w:color w:val="FFFFFF"/>
-                <w:sz w:val="20"/>
-                <w:szCs w:val="20"/>
-              </w:rPr>
-              <w:t xml:space="preserve">radial gain</w:t>
-            </w:r>
-          </w:p>
-        </w:tc>
-        <w:tc>
-          <w:tcPr>
-            <w:tcW w:type="dxa" w:w="1900"/>
-            <w:shd w:fill="1B2A4A" w:color="auto" w:val="clear"/>
-            <w:tcMar>
-              <w:top w:type="dxa" w:w="70"/>
-              <w:left w:type="dxa" w:w="100"/>
-              <w:bottom w:type="dxa" w:w="70"/>
-              <w:right w:type="dxa" w:w="100"/>
-            </w:tcMar>
-          </w:tcPr>
-          <w:p>
-            <w:pPr>
-              <w:keepNext/>
-              <w:spacing w:after="0"/>
-            </w:pPr>
-            <w:r>
-              <w:rPr>
-                <w:rFonts w:ascii="Cambria" w:cs="Cambria" w:eastAsia="Cambria" w:hAnsi="Cambria"/>
-                <w:b/>
-                <w:bCs/>
-                <w:i w:val="false"/>
-                <w:iCs w:val="false"/>
-                <w:caps w:val="false"/>
-                <w:color w:val="FFFFFF"/>
-                <w:sz w:val="20"/>
-                <w:szCs w:val="20"/>
-              </w:rPr>
-              <w:t xml:space="preserve">tangential gain</w:t>
-            </w:r>
-          </w:p>
-        </w:tc>
-        <w:tc>
-          <w:tcPr>
-            <w:tcW w:type="dxa" w:w="1860"/>
-            <w:shd w:fill="1B2A4A" w:color="auto" w:val="clear"/>
-            <w:tcMar>
-              <w:top w:type="dxa" w:w="70"/>
-              <w:left w:type="dxa" w:w="100"/>
-              <w:bottom w:type="dxa" w:w="70"/>
-              <w:right w:type="dxa" w:w="100"/>
-            </w:tcMar>
-          </w:tcPr>
-          <w:p>
-            <w:pPr>
-              <w:keepNext/>
-              <w:spacing w:after="0"/>
-            </w:pPr>
-            <w:r>
-              <w:rPr>
-                <w:rFonts w:ascii="Cambria" w:cs="Cambria" w:eastAsia="Cambria" w:hAnsi="Cambria"/>
-                <w:b/>
-                <w:bCs/>
-                <w:i w:val="false"/>
-                <w:iCs w:val="false"/>
-                <w:caps w:val="false"/>
-                <w:color w:val="FFFFFF"/>
-                <w:sz w:val="20"/>
-                <w:szCs w:val="20"/>
-              </w:rPr>
-              <w:t xml:space="preserve">tangential / radial</w:t>
-            </w:r>
-          </w:p>
-        </w:tc>
-      </w:tr>
-      <w:tr>
-        <w:trPr>
-          <w:cantSplit/>
-          <w:tblHeader w:val="false"/>
-        </w:trPr>
-        <w:tc>
-          <w:tcPr>
-            <w:tcW w:type="dxa" w:w="1900"/>
-            <w:shd w:fill="F0F5FA" w:color="auto" w:val="clear"/>
-            <w:tcMar>
-              <w:top w:type="dxa" w:w="70"/>
-              <w:left w:type="dxa" w:w="100"/>
-              <w:bottom w:type="dxa" w:w="70"/>
-              <w:right w:type="dxa" w:w="100"/>
-            </w:tcMar>
-          </w:tcPr>
-          <w:p>
-            <w:pPr>
-              <w:keepNext/>
-              <w:spacing w:after="0"/>
-            </w:pPr>
-            <w:r>
-              <w:rPr>
-                <w:rFonts w:ascii="Cambria" w:cs="Cambria" w:eastAsia="Cambria" w:hAnsi="Cambria"/>
-                <w:b/>
-                <w:bCs/>
-                <w:i w:val="false"/>
-                <w:iCs w:val="false"/>
-                <w:caps w:val="false"/>
-                <w:color w:val="333333"/>
-                <w:sz w:val="20"/>
-                <w:szCs w:val="20"/>
-              </w:rPr>
-              <w:t xml:space="preserve">90°</w:t>
-            </w:r>
-          </w:p>
-        </w:tc>
-        <w:tc>
-          <w:tcPr>
-            <w:tcW w:type="dxa" w:w="1800"/>
-            <w:shd w:fill="F0F5FA" w:color="auto" w:val="clear"/>
-            <w:tcMar>
-              <w:top w:type="dxa" w:w="70"/>
-              <w:left w:type="dxa" w:w="100"/>
-              <w:bottom w:type="dxa" w:w="70"/>
-              <w:right w:type="dxa" w:w="100"/>
-            </w:tcMar>
-          </w:tcPr>
-          <w:p>
-            <w:pPr>
-              <w:keepNext/>
-              <w:spacing w:after="0"/>
-            </w:pPr>
-            <w:r>
-              <w:rPr>
-                <w:rFonts w:ascii="Cambria" w:cs="Cambria" w:eastAsia="Cambria" w:hAnsi="Cambria"/>
-                <w:b w:val="false"/>
-                <w:bCs w:val="false"/>
-                <w:i w:val="false"/>
-                <w:iCs w:val="false"/>
-                <w:caps w:val="false"/>
-                <w:color w:val="333333"/>
-                <w:sz w:val="20"/>
-                <w:szCs w:val="20"/>
-              </w:rPr>
-              <w:t xml:space="preserve">0.1564</w:t>
-            </w:r>
-          </w:p>
-        </w:tc>
-        <w:tc>
-          <w:tcPr>
-            <w:tcW w:type="dxa" w:w="1900"/>
-            <w:shd w:fill="F0F5FA" w:color="auto" w:val="clear"/>
-            <w:tcMar>
-              <w:top w:type="dxa" w:w="70"/>
-              <w:left w:type="dxa" w:w="100"/>
-              <w:bottom w:type="dxa" w:w="70"/>
-              <w:right w:type="dxa" w:w="100"/>
-            </w:tcMar>
-          </w:tcPr>
-          <w:p>
-            <w:pPr>
-              <w:keepNext/>
-              <w:spacing w:after="0"/>
-            </w:pPr>
-            <w:r>
-              <w:rPr>
-                <w:rFonts w:ascii="Cambria" w:cs="Cambria" w:eastAsia="Cambria" w:hAnsi="Cambria"/>
-                <w:b w:val="false"/>
-                <w:bCs w:val="false"/>
-                <w:i w:val="false"/>
-                <w:iCs w:val="false"/>
-                <w:caps w:val="false"/>
-                <w:color w:val="333333"/>
-                <w:sz w:val="20"/>
-                <w:szCs w:val="20"/>
-              </w:rPr>
-              <w:t xml:space="preserve">5.57</w:t>
-            </w:r>
-          </w:p>
-        </w:tc>
-        <w:tc>
-          <w:tcPr>
-            <w:tcW w:type="dxa" w:w="1900"/>
-            <w:shd w:fill="F0F5FA" w:color="auto" w:val="clear"/>
-            <w:tcMar>
-              <w:top w:type="dxa" w:w="70"/>
-              <w:left w:type="dxa" w:w="100"/>
-              <w:bottom w:type="dxa" w:w="70"/>
-              <w:right w:type="dxa" w:w="100"/>
-            </w:tcMar>
-          </w:tcPr>
-          <w:p>
-            <w:pPr>
-              <w:keepNext/>
-              <w:spacing w:after="0"/>
-            </w:pPr>
-            <w:r>
-              <w:rPr>
-                <w:rFonts w:ascii="Cambria" w:cs="Cambria" w:eastAsia="Cambria" w:hAnsi="Cambria"/>
-                <w:b w:val="false"/>
-                <w:bCs w:val="false"/>
-                <w:i w:val="false"/>
-                <w:iCs w:val="false"/>
-                <w:caps w:val="false"/>
-                <w:color w:val="333333"/>
-                <w:sz w:val="20"/>
-                <w:szCs w:val="20"/>
-              </w:rPr>
-              <w:t xml:space="preserve">4.96</w:t>
-            </w:r>
-          </w:p>
-        </w:tc>
-        <w:tc>
-          <w:tcPr>
-            <w:tcW w:type="dxa" w:w="1860"/>
-            <w:shd w:fill="F0F5FA" w:color="auto" w:val="clear"/>
-            <w:tcMar>
-              <w:top w:type="dxa" w:w="70"/>
-              <w:left w:type="dxa" w:w="100"/>
-              <w:bottom w:type="dxa" w:w="70"/>
-              <w:right w:type="dxa" w:w="100"/>
-            </w:tcMar>
-          </w:tcPr>
-          <w:p>
-            <w:pPr>
-              <w:keepNext/>
-              <w:spacing w:after="0"/>
-            </w:pPr>
-            <w:r>
-              <w:rPr>
-                <w:rFonts w:ascii="Cambria" w:cs="Cambria" w:eastAsia="Cambria" w:hAnsi="Cambria"/>
-                <w:b w:val="false"/>
-                <w:bCs w:val="false"/>
-                <w:i w:val="false"/>
-                <w:iCs w:val="false"/>
-                <w:caps w:val="false"/>
-                <w:color w:val="333333"/>
-                <w:sz w:val="20"/>
-                <w:szCs w:val="20"/>
-              </w:rPr>
-              <w:t xml:space="preserve">0.9</w:t>
-            </w:r>
-          </w:p>
-        </w:tc>
-      </w:tr>
-      <w:tr>
-        <w:trPr>
-          <w:cantSplit/>
-          <w:tblHeader w:val="false"/>
-        </w:trPr>
-        <w:tc>
-          <w:tcPr>
-            <w:tcW w:type="dxa" w:w="1900"/>
-            <w:shd w:fill="F0F5FA" w:color="auto" w:val="clear"/>
-            <w:tcMar>
-              <w:top w:type="dxa" w:w="70"/>
-              <w:left w:type="dxa" w:w="100"/>
-              <w:bottom w:type="dxa" w:w="70"/>
-              <w:right w:type="dxa" w:w="100"/>
-            </w:tcMar>
-          </w:tcPr>
-          <w:p>
-            <w:pPr>
-              <w:keepNext/>
-              <w:spacing w:after="0"/>
-            </w:pPr>
-            <w:r>
-              <w:rPr>
-                <w:rFonts w:ascii="Cambria" w:cs="Cambria" w:eastAsia="Cambria" w:hAnsi="Cambria"/>
-                <w:b/>
-                <w:bCs/>
-                <w:i w:val="false"/>
-                <w:iCs w:val="false"/>
-                <w:caps w:val="false"/>
-                <w:color w:val="333333"/>
-                <w:sz w:val="20"/>
-                <w:szCs w:val="20"/>
-              </w:rPr>
-              <w:t xml:space="preserve">60°</w:t>
-            </w:r>
-          </w:p>
-        </w:tc>
-        <w:tc>
-          <w:tcPr>
-            <w:tcW w:type="dxa" w:w="1800"/>
-            <w:shd w:fill="F0F5FA" w:color="auto" w:val="clear"/>
-            <w:tcMar>
-              <w:top w:type="dxa" w:w="70"/>
-              <w:left w:type="dxa" w:w="100"/>
-              <w:bottom w:type="dxa" w:w="70"/>
-              <w:right w:type="dxa" w:w="100"/>
-            </w:tcMar>
-          </w:tcPr>
-          <w:p>
-            <w:pPr>
-              <w:keepNext/>
-              <w:spacing w:after="0"/>
-            </w:pPr>
-            <w:r>
-              <w:rPr>
-                <w:rFonts w:ascii="Cambria" w:cs="Cambria" w:eastAsia="Cambria" w:hAnsi="Cambria"/>
-                <w:b w:val="false"/>
-                <w:bCs w:val="false"/>
-                <w:i w:val="false"/>
-                <w:iCs w:val="false"/>
-                <w:caps w:val="false"/>
-                <w:color w:val="333333"/>
-                <w:sz w:val="20"/>
-                <w:szCs w:val="20"/>
-              </w:rPr>
-              <w:t xml:space="preserve">0.1354</w:t>
-            </w:r>
-          </w:p>
-        </w:tc>
-        <w:tc>
-          <w:tcPr>
-            <w:tcW w:type="dxa" w:w="1900"/>
-            <w:shd w:fill="F0F5FA" w:color="auto" w:val="clear"/>
-            <w:tcMar>
-              <w:top w:type="dxa" w:w="70"/>
-              <w:left w:type="dxa" w:w="100"/>
-              <w:bottom w:type="dxa" w:w="70"/>
-              <w:right w:type="dxa" w:w="100"/>
-            </w:tcMar>
-          </w:tcPr>
-          <w:p>
-            <w:pPr>
-              <w:keepNext/>
-              <w:spacing w:after="0"/>
-            </w:pPr>
-            <w:r>
-              <w:rPr>
-                <w:rFonts w:ascii="Cambria" w:cs="Cambria" w:eastAsia="Cambria" w:hAnsi="Cambria"/>
-                <w:b w:val="false"/>
-                <w:bCs w:val="false"/>
-                <w:i w:val="false"/>
-                <w:iCs w:val="false"/>
-                <w:caps w:val="false"/>
-                <w:color w:val="333333"/>
-                <w:sz w:val="20"/>
-                <w:szCs w:val="20"/>
-              </w:rPr>
-              <w:t xml:space="preserve">6.07</w:t>
-            </w:r>
-          </w:p>
-        </w:tc>
-        <w:tc>
-          <w:tcPr>
-            <w:tcW w:type="dxa" w:w="1900"/>
-            <w:shd w:fill="F0F5FA" w:color="auto" w:val="clear"/>
-            <w:tcMar>
-              <w:top w:type="dxa" w:w="70"/>
-              <w:left w:type="dxa" w:w="100"/>
-              <w:bottom w:type="dxa" w:w="70"/>
-              <w:right w:type="dxa" w:w="100"/>
-            </w:tcMar>
-          </w:tcPr>
-          <w:p>
-            <w:pPr>
-              <w:keepNext/>
-              <w:spacing w:after="0"/>
-            </w:pPr>
-            <w:r>
-              <w:rPr>
-                <w:rFonts w:ascii="Cambria" w:cs="Cambria" w:eastAsia="Cambria" w:hAnsi="Cambria"/>
-                <w:b w:val="false"/>
-                <w:bCs w:val="false"/>
-                <w:i w:val="false"/>
-                <w:iCs w:val="false"/>
-                <w:caps w:val="false"/>
-                <w:color w:val="333333"/>
-                <w:sz w:val="20"/>
-                <w:szCs w:val="20"/>
-              </w:rPr>
-              <w:t xml:space="preserve">6.59</w:t>
-            </w:r>
-          </w:p>
-        </w:tc>
-        <w:tc>
-          <w:tcPr>
-            <w:tcW w:type="dxa" w:w="1860"/>
-            <w:shd w:fill="F0F5FA" w:color="auto" w:val="clear"/>
-            <w:tcMar>
-              <w:top w:type="dxa" w:w="70"/>
-              <w:left w:type="dxa" w:w="100"/>
-              <w:bottom w:type="dxa" w:w="70"/>
-              <w:right w:type="dxa" w:w="100"/>
-            </w:tcMar>
-          </w:tcPr>
-          <w:p>
-            <w:pPr>
-              <w:keepNext/>
-              <w:spacing w:after="0"/>
-            </w:pPr>
-            <w:r>
-              <w:rPr>
-                <w:rFonts w:ascii="Cambria" w:cs="Cambria" w:eastAsia="Cambria" w:hAnsi="Cambria"/>
-                <w:b w:val="false"/>
-                <w:bCs w:val="false"/>
-                <w:i w:val="false"/>
-                <w:iCs w:val="false"/>
-                <w:caps w:val="false"/>
-                <w:color w:val="333333"/>
-                <w:sz w:val="20"/>
-                <w:szCs w:val="20"/>
-              </w:rPr>
-              <w:t xml:space="preserve">1.1</w:t>
-            </w:r>
-          </w:p>
-        </w:tc>
-      </w:tr>
-      <w:tr>
-        <w:trPr>
-          <w:cantSplit/>
-          <w:tblHeader w:val="false"/>
-        </w:trPr>
-        <w:tc>
-          <w:tcPr>
-            <w:tcW w:type="dxa" w:w="1900"/>
-            <w:shd w:fill="F0F5FA" w:color="auto" w:val="clear"/>
-            <w:tcMar>
-              <w:top w:type="dxa" w:w="70"/>
-              <w:left w:type="dxa" w:w="100"/>
-              <w:bottom w:type="dxa" w:w="70"/>
-              <w:right w:type="dxa" w:w="100"/>
-            </w:tcMar>
-          </w:tcPr>
-          <w:p>
-            <w:pPr>
-              <w:keepNext/>
-              <w:spacing w:after="0"/>
-            </w:pPr>
-            <w:r>
-              <w:rPr>
-                <w:rFonts w:ascii="Cambria" w:cs="Cambria" w:eastAsia="Cambria" w:hAnsi="Cambria"/>
-                <w:b/>
-                <w:bCs/>
-                <w:i w:val="false"/>
-                <w:iCs w:val="false"/>
-                <w:caps w:val="false"/>
-                <w:color w:val="333333"/>
-                <w:sz w:val="20"/>
-                <w:szCs w:val="20"/>
-              </w:rPr>
-              <w:t xml:space="preserve">40°</w:t>
-            </w:r>
-          </w:p>
-        </w:tc>
-        <w:tc>
-          <w:tcPr>
-            <w:tcW w:type="dxa" w:w="1800"/>
-            <w:shd w:fill="F0F5FA" w:color="auto" w:val="clear"/>
-            <w:tcMar>
-              <w:top w:type="dxa" w:w="70"/>
-              <w:left w:type="dxa" w:w="100"/>
-              <w:bottom w:type="dxa" w:w="70"/>
-              <w:right w:type="dxa" w:w="100"/>
-            </w:tcMar>
-          </w:tcPr>
-          <w:p>
-            <w:pPr>
-              <w:keepNext/>
-              <w:spacing w:after="0"/>
-            </w:pPr>
-            <w:r>
-              <w:rPr>
-                <w:rFonts w:ascii="Cambria" w:cs="Cambria" w:eastAsia="Cambria" w:hAnsi="Cambria"/>
-                <w:b w:val="false"/>
-                <w:bCs w:val="false"/>
-                <w:i w:val="false"/>
-                <w:iCs w:val="false"/>
-                <w:caps w:val="false"/>
-                <w:color w:val="333333"/>
-                <w:sz w:val="20"/>
-                <w:szCs w:val="20"/>
-              </w:rPr>
-              <w:t xml:space="preserve">0.1005</w:t>
-            </w:r>
-          </w:p>
-        </w:tc>
-        <w:tc>
-          <w:tcPr>
-            <w:tcW w:type="dxa" w:w="1900"/>
-            <w:shd w:fill="F0F5FA" w:color="auto" w:val="clear"/>
-            <w:tcMar>
-              <w:top w:type="dxa" w:w="70"/>
-              <w:left w:type="dxa" w:w="100"/>
-              <w:bottom w:type="dxa" w:w="70"/>
-              <w:right w:type="dxa" w:w="100"/>
-            </w:tcMar>
-          </w:tcPr>
-          <w:p>
-            <w:pPr>
-              <w:keepNext/>
-              <w:spacing w:after="0"/>
-            </w:pPr>
-            <w:r>
-              <w:rPr>
-                <w:rFonts w:ascii="Cambria" w:cs="Cambria" w:eastAsia="Cambria" w:hAnsi="Cambria"/>
-                <w:b w:val="false"/>
-                <w:bCs w:val="false"/>
-                <w:i w:val="false"/>
-                <w:iCs w:val="false"/>
-                <w:caps w:val="false"/>
-                <w:color w:val="333333"/>
-                <w:sz w:val="20"/>
-                <w:szCs w:val="20"/>
-              </w:rPr>
-              <w:t xml:space="preserve">5.97</w:t>
-            </w:r>
-          </w:p>
-        </w:tc>
-        <w:tc>
-          <w:tcPr>
-            <w:tcW w:type="dxa" w:w="1900"/>
-            <w:shd w:fill="F0F5FA" w:color="auto" w:val="clear"/>
-            <w:tcMar>
-              <w:top w:type="dxa" w:w="70"/>
-              <w:left w:type="dxa" w:w="100"/>
-              <w:bottom w:type="dxa" w:w="70"/>
-              <w:right w:type="dxa" w:w="100"/>
-            </w:tcMar>
-          </w:tcPr>
-          <w:p>
-            <w:pPr>
-              <w:keepNext/>
-              <w:spacing w:after="0"/>
-            </w:pPr>
-            <w:r>
-              <w:rPr>
-                <w:rFonts w:ascii="Cambria" w:cs="Cambria" w:eastAsia="Cambria" w:hAnsi="Cambria"/>
-                <w:b w:val="false"/>
-                <w:bCs w:val="false"/>
-                <w:i w:val="false"/>
-                <w:iCs w:val="false"/>
-                <w:caps w:val="false"/>
-                <w:color w:val="333333"/>
-                <w:sz w:val="20"/>
-                <w:szCs w:val="20"/>
-              </w:rPr>
-              <w:t xml:space="preserve">8.99</w:t>
-            </w:r>
-          </w:p>
-        </w:tc>
-        <w:tc>
-          <w:tcPr>
-            <w:tcW w:type="dxa" w:w="1860"/>
-            <w:shd w:fill="F0F5FA" w:color="auto" w:val="clear"/>
-            <w:tcMar>
-              <w:top w:type="dxa" w:w="70"/>
-              <w:left w:type="dxa" w:w="100"/>
-              <w:bottom w:type="dxa" w:w="70"/>
-              <w:right w:type="dxa" w:w="100"/>
-            </w:tcMar>
-          </w:tcPr>
-          <w:p>
-            <w:pPr>
-              <w:keepNext/>
-              <w:spacing w:after="0"/>
-            </w:pPr>
-            <w:r>
-              <w:rPr>
-                <w:rFonts w:ascii="Cambria" w:cs="Cambria" w:eastAsia="Cambria" w:hAnsi="Cambria"/>
-                <w:b w:val="false"/>
-                <w:bCs w:val="false"/>
-                <w:i w:val="false"/>
-                <w:iCs w:val="false"/>
-                <w:caps w:val="false"/>
-                <w:color w:val="333333"/>
-                <w:sz w:val="20"/>
-                <w:szCs w:val="20"/>
-              </w:rPr>
-              <w:t xml:space="preserve">1.5</w:t>
-            </w:r>
-          </w:p>
-        </w:tc>
-      </w:tr>
-      <w:tr>
-        <w:trPr>
-          <w:cantSplit/>
-          <w:tblHeader w:val="false"/>
-        </w:trPr>
-        <w:tc>
-          <w:tcPr>
-            <w:tcW w:type="dxa" w:w="1900"/>
-            <w:shd w:fill="F0F5FA" w:color="auto" w:val="clear"/>
-            <w:tcMar>
-              <w:top w:type="dxa" w:w="70"/>
-              <w:left w:type="dxa" w:w="100"/>
-              <w:bottom w:type="dxa" w:w="70"/>
-              <w:right w:type="dxa" w:w="100"/>
-            </w:tcMar>
-          </w:tcPr>
-          <w:p>
-            <w:pPr>
-              <w:keepNext/>
-              <w:spacing w:after="0"/>
-            </w:pPr>
-            <w:r>
-              <w:rPr>
-                <w:rFonts w:ascii="Cambria" w:cs="Cambria" w:eastAsia="Cambria" w:hAnsi="Cambria"/>
-                <w:b/>
-                <w:bCs/>
-                <w:i w:val="false"/>
-                <w:iCs w:val="false"/>
-                <w:caps w:val="false"/>
-                <w:color w:val="333333"/>
-                <w:sz w:val="20"/>
-                <w:szCs w:val="20"/>
-              </w:rPr>
-              <w:t xml:space="preserve">25°</w:t>
-            </w:r>
-          </w:p>
-        </w:tc>
-        <w:tc>
-          <w:tcPr>
-            <w:tcW w:type="dxa" w:w="1800"/>
-            <w:shd w:fill="F0F5FA" w:color="auto" w:val="clear"/>
-            <w:tcMar>
-              <w:top w:type="dxa" w:w="70"/>
-              <w:left w:type="dxa" w:w="100"/>
-              <w:bottom w:type="dxa" w:w="70"/>
-              <w:right w:type="dxa" w:w="100"/>
-            </w:tcMar>
-          </w:tcPr>
-          <w:p>
-            <w:pPr>
-              <w:keepNext/>
-              <w:spacing w:after="0"/>
-            </w:pPr>
-            <w:r>
-              <w:rPr>
-                <w:rFonts w:ascii="Cambria" w:cs="Cambria" w:eastAsia="Cambria" w:hAnsi="Cambria"/>
-                <w:b w:val="false"/>
-                <w:bCs w:val="false"/>
-                <w:i w:val="false"/>
-                <w:iCs w:val="false"/>
-                <w:caps w:val="false"/>
-                <w:color w:val="333333"/>
-                <w:sz w:val="20"/>
-                <w:szCs w:val="20"/>
-              </w:rPr>
-              <w:t xml:space="preserve">0.0661</w:t>
-            </w:r>
-          </w:p>
-        </w:tc>
-        <w:tc>
-          <w:tcPr>
-            <w:tcW w:type="dxa" w:w="1900"/>
-            <w:shd w:fill="F0F5FA" w:color="auto" w:val="clear"/>
-            <w:tcMar>
-              <w:top w:type="dxa" w:w="70"/>
-              <w:left w:type="dxa" w:w="100"/>
-              <w:bottom w:type="dxa" w:w="70"/>
-              <w:right w:type="dxa" w:w="100"/>
-            </w:tcMar>
-          </w:tcPr>
-          <w:p>
-            <w:pPr>
-              <w:keepNext/>
-              <w:spacing w:after="0"/>
-            </w:pPr>
-            <w:r>
-              <w:rPr>
-                <w:rFonts w:ascii="Cambria" w:cs="Cambria" w:eastAsia="Cambria" w:hAnsi="Cambria"/>
-                <w:b w:val="false"/>
-                <w:bCs w:val="false"/>
-                <w:i w:val="false"/>
-                <w:iCs w:val="false"/>
-                <w:caps w:val="false"/>
-                <w:color w:val="333333"/>
-                <w:sz w:val="20"/>
-                <w:szCs w:val="20"/>
-              </w:rPr>
-              <w:t xml:space="preserve">4.94</w:t>
-            </w:r>
-          </w:p>
-        </w:tc>
-        <w:tc>
-          <w:tcPr>
-            <w:tcW w:type="dxa" w:w="1900"/>
-            <w:shd w:fill="F0F5FA" w:color="auto" w:val="clear"/>
-            <w:tcMar>
-              <w:top w:type="dxa" w:w="70"/>
-              <w:left w:type="dxa" w:w="100"/>
-              <w:bottom w:type="dxa" w:w="70"/>
-              <w:right w:type="dxa" w:w="100"/>
-            </w:tcMar>
-          </w:tcPr>
-          <w:p>
-            <w:pPr>
-              <w:keepNext/>
-              <w:spacing w:after="0"/>
-            </w:pPr>
-            <w:r>
-              <w:rPr>
-                <w:rFonts w:ascii="Cambria" w:cs="Cambria" w:eastAsia="Cambria" w:hAnsi="Cambria"/>
-                <w:b w:val="false"/>
-                <w:bCs w:val="false"/>
-                <w:i w:val="false"/>
-                <w:iCs w:val="false"/>
-                <w:caps w:val="false"/>
-                <w:color w:val="333333"/>
-                <w:sz w:val="20"/>
-                <w:szCs w:val="20"/>
-              </w:rPr>
-              <w:t xml:space="preserve">11.50</w:t>
-            </w:r>
-          </w:p>
-        </w:tc>
-        <w:tc>
-          <w:tcPr>
-            <w:tcW w:type="dxa" w:w="1860"/>
-            <w:shd w:fill="F0F5FA" w:color="auto" w:val="clear"/>
-            <w:tcMar>
-              <w:top w:type="dxa" w:w="70"/>
-              <w:left w:type="dxa" w:w="100"/>
-              <w:bottom w:type="dxa" w:w="70"/>
-              <w:right w:type="dxa" w:w="100"/>
-            </w:tcMar>
-          </w:tcPr>
-          <w:p>
-            <w:pPr>
-              <w:keepNext/>
-              <w:spacing w:after="0"/>
-            </w:pPr>
-            <w:r>
-              <w:rPr>
-                <w:rFonts w:ascii="Cambria" w:cs="Cambria" w:eastAsia="Cambria" w:hAnsi="Cambria"/>
-                <w:b w:val="false"/>
-                <w:bCs w:val="false"/>
-                <w:i w:val="false"/>
-                <w:iCs w:val="false"/>
-                <w:caps w:val="false"/>
-                <w:color w:val="333333"/>
-                <w:sz w:val="20"/>
-                <w:szCs w:val="20"/>
-              </w:rPr>
-              <w:t xml:space="preserve">2.3</w:t>
-            </w:r>
-          </w:p>
-        </w:tc>
-      </w:tr>
-      <w:tr>
-        <w:trPr>
-          <w:cantSplit/>
-          <w:tblHeader w:val="false"/>
-        </w:trPr>
-        <w:tc>
-          <w:tcPr>
-            <w:tcW w:type="dxa" w:w="1900"/>
-            <w:shd w:fill="F0F5FA" w:color="auto" w:val="clear"/>
-            <w:tcMar>
-              <w:top w:type="dxa" w:w="70"/>
-              <w:left w:type="dxa" w:w="100"/>
-              <w:bottom w:type="dxa" w:w="70"/>
-              <w:right w:type="dxa" w:w="100"/>
-            </w:tcMar>
-          </w:tcPr>
-          <w:p>
-            <w:pPr>
-              <w:keepNext/>
-              <w:spacing w:after="0"/>
-            </w:pPr>
-            <w:r>
-              <w:rPr>
-                <w:rFonts w:ascii="Cambria" w:cs="Cambria" w:eastAsia="Cambria" w:hAnsi="Cambria"/>
-                <w:b/>
-                <w:bCs/>
-                <w:i w:val="false"/>
-                <w:iCs w:val="false"/>
-                <w:caps w:val="false"/>
-                <w:color w:val="333333"/>
-                <w:sz w:val="20"/>
-                <w:szCs w:val="20"/>
-              </w:rPr>
-              <w:t xml:space="preserve">15°</w:t>
-            </w:r>
-          </w:p>
-        </w:tc>
-        <w:tc>
-          <w:tcPr>
-            <w:tcW w:type="dxa" w:w="1800"/>
-            <w:shd w:fill="F0F5FA" w:color="auto" w:val="clear"/>
-            <w:tcMar>
-              <w:top w:type="dxa" w:w="70"/>
-              <w:left w:type="dxa" w:w="100"/>
-              <w:bottom w:type="dxa" w:w="70"/>
-              <w:right w:type="dxa" w:w="100"/>
-            </w:tcMar>
-          </w:tcPr>
-          <w:p>
-            <w:pPr>
-              <w:keepNext/>
-              <w:spacing w:after="0"/>
-            </w:pPr>
-            <w:r>
-              <w:rPr>
-                <w:rFonts w:ascii="Cambria" w:cs="Cambria" w:eastAsia="Cambria" w:hAnsi="Cambria"/>
-                <w:b w:val="false"/>
-                <w:bCs w:val="false"/>
-                <w:i w:val="false"/>
-                <w:iCs w:val="false"/>
-                <w:caps w:val="false"/>
-                <w:color w:val="333333"/>
-                <w:sz w:val="20"/>
-                <w:szCs w:val="20"/>
-              </w:rPr>
-              <w:t xml:space="preserve">0.0405</w:t>
-            </w:r>
-          </w:p>
-        </w:tc>
-        <w:tc>
-          <w:tcPr>
-            <w:tcW w:type="dxa" w:w="1900"/>
-            <w:shd w:fill="F0F5FA" w:color="auto" w:val="clear"/>
-            <w:tcMar>
-              <w:top w:type="dxa" w:w="70"/>
-              <w:left w:type="dxa" w:w="100"/>
-              <w:bottom w:type="dxa" w:w="70"/>
-              <w:right w:type="dxa" w:w="100"/>
-            </w:tcMar>
-          </w:tcPr>
-          <w:p>
-            <w:pPr>
-              <w:keepNext/>
-              <w:spacing w:after="0"/>
-            </w:pPr>
-            <w:r>
-              <w:rPr>
-                <w:rFonts w:ascii="Cambria" w:cs="Cambria" w:eastAsia="Cambria" w:hAnsi="Cambria"/>
-                <w:b w:val="false"/>
-                <w:bCs w:val="false"/>
-                <w:i w:val="false"/>
-                <w:iCs w:val="false"/>
-                <w:caps w:val="false"/>
-                <w:color w:val="333333"/>
-                <w:sz w:val="20"/>
-                <w:szCs w:val="20"/>
-              </w:rPr>
-              <w:t xml:space="preserve">3.43</w:t>
-            </w:r>
-          </w:p>
-        </w:tc>
-        <w:tc>
-          <w:tcPr>
-            <w:tcW w:type="dxa" w:w="1900"/>
-            <w:shd w:fill="F0F5FA" w:color="auto" w:val="clear"/>
-            <w:tcMar>
-              <w:top w:type="dxa" w:w="70"/>
-              <w:left w:type="dxa" w:w="100"/>
-              <w:bottom w:type="dxa" w:w="70"/>
-              <w:right w:type="dxa" w:w="100"/>
-            </w:tcMar>
-          </w:tcPr>
-          <w:p>
-            <w:pPr>
-              <w:keepNext/>
-              <w:spacing w:after="0"/>
-            </w:pPr>
-            <w:r>
-              <w:rPr>
-                <w:rFonts w:ascii="Cambria" w:cs="Cambria" w:eastAsia="Cambria" w:hAnsi="Cambria"/>
-                <w:b w:val="false"/>
-                <w:bCs w:val="false"/>
-                <w:i w:val="false"/>
-                <w:iCs w:val="false"/>
-                <w:caps w:val="false"/>
-                <w:color w:val="333333"/>
-                <w:sz w:val="20"/>
-                <w:szCs w:val="20"/>
-              </w:rPr>
-              <w:t xml:space="preserve">13.13</w:t>
-            </w:r>
-          </w:p>
-        </w:tc>
-        <w:tc>
-          <w:tcPr>
-            <w:tcW w:type="dxa" w:w="1860"/>
-            <w:shd w:fill="F0F5FA" w:color="auto" w:val="clear"/>
-            <w:tcMar>
-              <w:top w:type="dxa" w:w="70"/>
-              <w:left w:type="dxa" w:w="100"/>
-              <w:bottom w:type="dxa" w:w="70"/>
-              <w:right w:type="dxa" w:w="100"/>
-            </w:tcMar>
-          </w:tcPr>
-          <w:p>
-            <w:pPr>
-              <w:keepNext/>
-              <w:spacing w:after="0"/>
-            </w:pPr>
-            <w:r>
-              <w:rPr>
-                <w:rFonts w:ascii="Cambria" w:cs="Cambria" w:eastAsia="Cambria" w:hAnsi="Cambria"/>
-                <w:b w:val="false"/>
-                <w:bCs w:val="false"/>
-                <w:i w:val="false"/>
-                <w:iCs w:val="false"/>
-                <w:caps w:val="false"/>
-                <w:color w:val="333333"/>
-                <w:sz w:val="20"/>
-                <w:szCs w:val="20"/>
-              </w:rPr>
-              <w:t xml:space="preserve">3.8</w:t>
-            </w:r>
-          </w:p>
-        </w:tc>
-      </w:tr>
-      <w:tr>
-        <w:trPr>
-          <w:cantSplit/>
-          <w:tblHeader w:val="false"/>
-        </w:trPr>
-        <w:tc>
-          <w:tcPr>
-            <w:tcW w:type="dxa" w:w="1900"/>
-            <w:shd w:fill="F0F5FA" w:color="auto" w:val="clear"/>
-            <w:tcMar>
-              <w:top w:type="dxa" w:w="70"/>
-              <w:left w:type="dxa" w:w="100"/>
-              <w:bottom w:type="dxa" w:w="70"/>
-              <w:right w:type="dxa" w:w="100"/>
-            </w:tcMar>
-          </w:tcPr>
-          <w:p>
-            <w:pPr>
-              <w:keepNext/>
-              <w:spacing w:after="0"/>
-            </w:pPr>
-            <w:r>
-              <w:rPr>
-                <w:rFonts w:ascii="Cambria" w:cs="Cambria" w:eastAsia="Cambria" w:hAnsi="Cambria"/>
-                <w:b/>
-                <w:bCs/>
-                <w:i w:val="false"/>
-                <w:iCs w:val="false"/>
-                <w:caps w:val="false"/>
-                <w:color w:val="333333"/>
-                <w:sz w:val="20"/>
-                <w:szCs w:val="20"/>
-              </w:rPr>
-              <w:t xml:space="preserve">8°</w:t>
-            </w:r>
-          </w:p>
-        </w:tc>
-        <w:tc>
-          <w:tcPr>
-            <w:tcW w:type="dxa" w:w="1800"/>
-            <w:shd w:fill="F0F5FA" w:color="auto" w:val="clear"/>
-            <w:tcMar>
-              <w:top w:type="dxa" w:w="70"/>
-              <w:left w:type="dxa" w:w="100"/>
-              <w:bottom w:type="dxa" w:w="70"/>
-              <w:right w:type="dxa" w:w="100"/>
-            </w:tcMar>
-          </w:tcPr>
-          <w:p>
-            <w:pPr>
-              <w:keepNext/>
-              <w:spacing w:after="0"/>
-            </w:pPr>
-            <w:r>
-              <w:rPr>
-                <w:rFonts w:ascii="Cambria" w:cs="Cambria" w:eastAsia="Cambria" w:hAnsi="Cambria"/>
-                <w:b w:val="false"/>
-                <w:bCs w:val="false"/>
-                <w:i w:val="false"/>
-                <w:iCs w:val="false"/>
-                <w:caps w:val="false"/>
-                <w:color w:val="333333"/>
-                <w:sz w:val="20"/>
-                <w:szCs w:val="20"/>
-              </w:rPr>
-              <w:t xml:space="preserve">0.0218</w:t>
-            </w:r>
-          </w:p>
-        </w:tc>
-        <w:tc>
-          <w:tcPr>
-            <w:tcW w:type="dxa" w:w="1900"/>
-            <w:shd w:fill="F0F5FA" w:color="auto" w:val="clear"/>
-            <w:tcMar>
-              <w:top w:type="dxa" w:w="70"/>
-              <w:left w:type="dxa" w:w="100"/>
-              <w:bottom w:type="dxa" w:w="70"/>
-              <w:right w:type="dxa" w:w="100"/>
-            </w:tcMar>
-          </w:tcPr>
-          <w:p>
-            <w:pPr>
-              <w:keepNext/>
-              <w:spacing w:after="0"/>
-            </w:pPr>
-            <w:r>
-              <w:rPr>
-                <w:rFonts w:ascii="Cambria" w:cs="Cambria" w:eastAsia="Cambria" w:hAnsi="Cambria"/>
-                <w:b w:val="false"/>
-                <w:bCs w:val="false"/>
-                <w:i w:val="false"/>
-                <w:iCs w:val="false"/>
-                <w:caps w:val="false"/>
-                <w:color w:val="333333"/>
-                <w:sz w:val="20"/>
-                <w:szCs w:val="20"/>
-              </w:rPr>
-              <w:t xml:space="preserve">1.95</w:t>
-            </w:r>
-          </w:p>
-        </w:tc>
-        <w:tc>
-          <w:tcPr>
-            <w:tcW w:type="dxa" w:w="1900"/>
-            <w:shd w:fill="F0F5FA" w:color="auto" w:val="clear"/>
-            <w:tcMar>
-              <w:top w:type="dxa" w:w="70"/>
-              <w:left w:type="dxa" w:w="100"/>
-              <w:bottom w:type="dxa" w:w="70"/>
-              <w:right w:type="dxa" w:w="100"/>
-            </w:tcMar>
-          </w:tcPr>
-          <w:p>
-            <w:pPr>
-              <w:keepNext/>
-              <w:spacing w:after="0"/>
-            </w:pPr>
-            <w:r>
-              <w:rPr>
-                <w:rFonts w:ascii="Cambria" w:cs="Cambria" w:eastAsia="Cambria" w:hAnsi="Cambria"/>
-                <w:b w:val="false"/>
-                <w:bCs w:val="false"/>
-                <w:i w:val="false"/>
-                <w:iCs w:val="false"/>
-                <w:caps w:val="false"/>
-                <w:color w:val="333333"/>
-                <w:sz w:val="20"/>
-                <w:szCs w:val="20"/>
-              </w:rPr>
-              <w:t xml:space="preserve">13.95</w:t>
-            </w:r>
-          </w:p>
-        </w:tc>
-        <w:tc>
-          <w:tcPr>
-            <w:tcW w:type="dxa" w:w="1860"/>
-            <w:shd w:fill="F0F5FA" w:color="auto" w:val="clear"/>
-            <w:tcMar>
-              <w:top w:type="dxa" w:w="70"/>
-              <w:left w:type="dxa" w:w="100"/>
-              <w:bottom w:type="dxa" w:w="70"/>
-              <w:right w:type="dxa" w:w="100"/>
-            </w:tcMar>
-          </w:tcPr>
-          <w:p>
-            <w:pPr>
-              <w:keepNext/>
-              <w:spacing w:after="0"/>
-            </w:pPr>
-            <w:r>
-              <w:rPr>
-                <w:rFonts w:ascii="Cambria" w:cs="Cambria" w:eastAsia="Cambria" w:hAnsi="Cambria"/>
-                <w:b w:val="false"/>
-                <w:bCs w:val="false"/>
-                <w:i w:val="false"/>
-                <w:iCs w:val="false"/>
-                <w:caps w:val="false"/>
-                <w:color w:val="333333"/>
-                <w:sz w:val="20"/>
-                <w:szCs w:val="20"/>
-              </w:rPr>
-              <w:t xml:space="preserve">7.1</w:t>
-            </w:r>
-          </w:p>
-        </w:tc>
-      </w:tr>
-      <w:tr>
-        <w:trPr>
-          <w:cantSplit/>
-          <w:tblHeader w:val="false"/>
-        </w:trPr>
-        <w:tc>
-          <w:tcPr>
-            <w:tcW w:type="dxa" w:w="1900"/>
-            <w:shd w:fill="F0F5FA" w:color="auto" w:val="clear"/>
-            <w:tcMar>
-              <w:top w:type="dxa" w:w="70"/>
-              <w:left w:type="dxa" w:w="100"/>
-              <w:bottom w:type="dxa" w:w="70"/>
-              <w:right w:type="dxa" w:w="100"/>
-            </w:tcMar>
-          </w:tcPr>
-          <w:p>
-            <w:pPr>
-              <w:keepNext/>
-              <w:spacing w:after="0"/>
-            </w:pPr>
-            <w:r>
-              <w:rPr>
-                <w:rFonts w:ascii="Cambria" w:cs="Cambria" w:eastAsia="Cambria" w:hAnsi="Cambria"/>
-                <w:b/>
-                <w:bCs/>
-                <w:i w:val="false"/>
-                <w:iCs w:val="false"/>
-                <w:caps w:val="false"/>
-                <w:color w:val="333333"/>
-                <w:sz w:val="20"/>
-                <w:szCs w:val="20"/>
-              </w:rPr>
-              <w:t xml:space="preserve">4°</w:t>
-            </w:r>
-          </w:p>
-        </w:tc>
-        <w:tc>
-          <w:tcPr>
-            <w:tcW w:type="dxa" w:w="1800"/>
-            <w:shd w:fill="F0F5FA" w:color="auto" w:val="clear"/>
-            <w:tcMar>
-              <w:top w:type="dxa" w:w="70"/>
-              <w:left w:type="dxa" w:w="100"/>
-              <w:bottom w:type="dxa" w:w="70"/>
-              <w:right w:type="dxa" w:w="100"/>
-            </w:tcMar>
-          </w:tcPr>
-          <w:p>
-            <w:pPr>
-              <w:keepNext/>
-              <w:spacing w:after="0"/>
-            </w:pPr>
-            <w:r>
-              <w:rPr>
-                <w:rFonts w:ascii="Cambria" w:cs="Cambria" w:eastAsia="Cambria" w:hAnsi="Cambria"/>
-                <w:b w:val="false"/>
-                <w:bCs w:val="false"/>
-                <w:i w:val="false"/>
-                <w:iCs w:val="false"/>
-                <w:caps w:val="false"/>
-                <w:color w:val="333333"/>
-                <w:sz w:val="20"/>
-                <w:szCs w:val="20"/>
-              </w:rPr>
-              <w:t xml:space="preserve">0.0109</w:t>
-            </w:r>
-          </w:p>
-        </w:tc>
-        <w:tc>
-          <w:tcPr>
-            <w:tcW w:type="dxa" w:w="1900"/>
-            <w:shd w:fill="F0F5FA" w:color="auto" w:val="clear"/>
-            <w:tcMar>
-              <w:top w:type="dxa" w:w="70"/>
-              <w:left w:type="dxa" w:w="100"/>
-              <w:bottom w:type="dxa" w:w="70"/>
-              <w:right w:type="dxa" w:w="100"/>
-            </w:tcMar>
-          </w:tcPr>
-          <w:p>
-            <w:pPr>
-              <w:keepNext/>
-              <w:spacing w:after="0"/>
-            </w:pPr>
-            <w:r>
-              <w:rPr>
-                <w:rFonts w:ascii="Cambria" w:cs="Cambria" w:eastAsia="Cambria" w:hAnsi="Cambria"/>
-                <w:b w:val="false"/>
-                <w:bCs w:val="false"/>
-                <w:i w:val="false"/>
-                <w:iCs w:val="false"/>
-                <w:caps w:val="false"/>
-                <w:color w:val="333333"/>
-                <w:sz w:val="20"/>
-                <w:szCs w:val="20"/>
-              </w:rPr>
-              <w:t xml:space="preserve">1.00</w:t>
-            </w:r>
-          </w:p>
-        </w:tc>
-        <w:tc>
-          <w:tcPr>
-            <w:tcW w:type="dxa" w:w="1900"/>
-            <w:shd w:fill="F0F5FA" w:color="auto" w:val="clear"/>
-            <w:tcMar>
-              <w:top w:type="dxa" w:w="70"/>
-              <w:left w:type="dxa" w:w="100"/>
-              <w:bottom w:type="dxa" w:w="70"/>
-              <w:right w:type="dxa" w:w="100"/>
-            </w:tcMar>
-          </w:tcPr>
-          <w:p>
-            <w:pPr>
-              <w:keepNext/>
-              <w:spacing w:after="0"/>
-            </w:pPr>
-            <w:r>
-              <w:rPr>
-                <w:rFonts w:ascii="Cambria" w:cs="Cambria" w:eastAsia="Cambria" w:hAnsi="Cambria"/>
-                <w:b w:val="false"/>
-                <w:bCs w:val="false"/>
-                <w:i w:val="false"/>
-                <w:iCs w:val="false"/>
-                <w:caps w:val="false"/>
-                <w:color w:val="333333"/>
-                <w:sz w:val="20"/>
-                <w:szCs w:val="20"/>
-              </w:rPr>
-              <w:t xml:space="preserve">14.22</w:t>
-            </w:r>
-          </w:p>
-        </w:tc>
-        <w:tc>
-          <w:tcPr>
-            <w:tcW w:type="dxa" w:w="1860"/>
-            <w:shd w:fill="F0F5FA" w:color="auto" w:val="clear"/>
-            <w:tcMar>
-              <w:top w:type="dxa" w:w="70"/>
-              <w:left w:type="dxa" w:w="100"/>
-              <w:bottom w:type="dxa" w:w="70"/>
-              <w:right w:type="dxa" w:w="100"/>
-            </w:tcMar>
-          </w:tcPr>
-          <w:p>
-            <w:pPr>
-              <w:keepNext/>
-              <w:spacing w:after="0"/>
-            </w:pPr>
-            <w:r>
-              <w:rPr>
-                <w:rFonts w:ascii="Cambria" w:cs="Cambria" w:eastAsia="Cambria" w:hAnsi="Cambria"/>
-                <w:b w:val="false"/>
-                <w:bCs w:val="false"/>
-                <w:i w:val="false"/>
-                <w:iCs w:val="false"/>
-                <w:caps w:val="false"/>
-                <w:color w:val="333333"/>
-                <w:sz w:val="20"/>
-                <w:szCs w:val="20"/>
-              </w:rPr>
-              <w:t xml:space="preserve">14.3</w:t>
-            </w:r>
-          </w:p>
-        </w:tc>
-      </w:tr>
-      <w:tr>
-        <w:trPr>
-          <w:cantSplit/>
-          <w:tblHeader w:val="false"/>
-        </w:trPr>
-        <w:tc>
-          <w:tcPr>
-            <w:tcW w:type="dxa" w:w="1900"/>
-            <w:shd w:fill="F0F5FA" w:color="auto" w:val="clear"/>
-            <w:tcMar>
-              <w:top w:type="dxa" w:w="70"/>
-              <w:left w:type="dxa" w:w="100"/>
-              <w:bottom w:type="dxa" w:w="70"/>
-              <w:right w:type="dxa" w:w="100"/>
-            </w:tcMar>
-          </w:tcPr>
-          <w:p>
-            <w:pPr>
-              <w:keepNext w:val="false"/>
-              <w:spacing w:after="0"/>
-            </w:pPr>
-            <w:r>
-              <w:rPr>
-                <w:rFonts w:ascii="Cambria" w:cs="Cambria" w:eastAsia="Cambria" w:hAnsi="Cambria"/>
-                <w:b/>
-                <w:bCs/>
-                <w:i w:val="false"/>
-                <w:iCs w:val="false"/>
-                <w:caps w:val="false"/>
-                <w:color w:val="333333"/>
-                <w:sz w:val="20"/>
-                <w:szCs w:val="20"/>
-              </w:rPr>
-              <w:t xml:space="preserve">2°</w:t>
-            </w:r>
-          </w:p>
-        </w:tc>
-        <w:tc>
-          <w:tcPr>
-            <w:tcW w:type="dxa" w:w="1800"/>
-            <w:shd w:fill="F0F5FA" w:color="auto" w:val="clear"/>
-            <w:tcMar>
-              <w:top w:type="dxa" w:w="70"/>
-              <w:left w:type="dxa" w:w="100"/>
-              <w:bottom w:type="dxa" w:w="70"/>
-              <w:right w:type="dxa" w:w="100"/>
-            </w:tcMar>
-          </w:tcPr>
-          <w:p>
-            <w:pPr>
-              <w:keepNext w:val="false"/>
-              <w:spacing w:after="0"/>
-            </w:pPr>
-            <w:r>
-              <w:rPr>
-                <w:rFonts w:ascii="Cambria" w:cs="Cambria" w:eastAsia="Cambria" w:hAnsi="Cambria"/>
-                <w:b w:val="false"/>
-                <w:bCs w:val="false"/>
-                <w:i w:val="false"/>
-                <w:iCs w:val="false"/>
-                <w:caps w:val="false"/>
-                <w:color w:val="333333"/>
-                <w:sz w:val="20"/>
-                <w:szCs w:val="20"/>
-              </w:rPr>
-              <w:t xml:space="preserve">0.0055</w:t>
-            </w:r>
-          </w:p>
-        </w:tc>
-        <w:tc>
-          <w:tcPr>
-            <w:tcW w:type="dxa" w:w="1900"/>
-            <w:shd w:fill="F0F5FA" w:color="auto" w:val="clear"/>
-            <w:tcMar>
-              <w:top w:type="dxa" w:w="70"/>
-              <w:left w:type="dxa" w:w="100"/>
-              <w:bottom w:type="dxa" w:w="70"/>
-              <w:right w:type="dxa" w:w="100"/>
-            </w:tcMar>
-          </w:tcPr>
-          <w:p>
-            <w:pPr>
-              <w:keepNext w:val="false"/>
-              <w:spacing w:after="0"/>
-            </w:pPr>
-            <w:r>
-              <w:rPr>
-                <w:rFonts w:ascii="Cambria" w:cs="Cambria" w:eastAsia="Cambria" w:hAnsi="Cambria"/>
-                <w:b w:val="false"/>
-                <w:bCs w:val="false"/>
-                <w:i w:val="false"/>
-                <w:iCs w:val="false"/>
-                <w:caps w:val="false"/>
-                <w:color w:val="333333"/>
-                <w:sz w:val="20"/>
-                <w:szCs w:val="20"/>
-              </w:rPr>
-              <w:t xml:space="preserve">0.50</w:t>
-            </w:r>
-          </w:p>
-        </w:tc>
-        <w:tc>
-          <w:tcPr>
-            <w:tcW w:type="dxa" w:w="1900"/>
-            <w:shd w:fill="F0F5FA" w:color="auto" w:val="clear"/>
-            <w:tcMar>
-              <w:top w:type="dxa" w:w="70"/>
-              <w:left w:type="dxa" w:w="100"/>
-              <w:bottom w:type="dxa" w:w="70"/>
-              <w:right w:type="dxa" w:w="100"/>
-            </w:tcMar>
-          </w:tcPr>
-          <w:p>
-            <w:pPr>
-              <w:keepNext w:val="false"/>
-              <w:spacing w:after="0"/>
-            </w:pPr>
-            <w:r>
-              <w:rPr>
-                <w:rFonts w:ascii="Cambria" w:cs="Cambria" w:eastAsia="Cambria" w:hAnsi="Cambria"/>
-                <w:b w:val="false"/>
-                <w:bCs w:val="false"/>
-                <w:i w:val="false"/>
-                <w:iCs w:val="false"/>
-                <w:caps w:val="false"/>
-                <w:color w:val="333333"/>
-                <w:sz w:val="20"/>
-                <w:szCs w:val="20"/>
-              </w:rPr>
-              <w:t xml:space="preserve">14.29</w:t>
-            </w:r>
-          </w:p>
-        </w:tc>
-        <w:tc>
-          <w:tcPr>
-            <w:tcW w:type="dxa" w:w="1860"/>
-            <w:shd w:fill="F0F5FA" w:color="auto" w:val="clear"/>
-            <w:tcMar>
-              <w:top w:type="dxa" w:w="70"/>
-              <w:left w:type="dxa" w:w="100"/>
-              <w:bottom w:type="dxa" w:w="70"/>
-              <w:right w:type="dxa" w:w="100"/>
-            </w:tcMar>
-          </w:tcPr>
-          <w:p>
-            <w:pPr>
-              <w:keepNext w:val="false"/>
-              <w:spacing w:after="0"/>
-            </w:pPr>
-            <w:r>
-              <w:rPr>
-                <w:rFonts w:ascii="Cambria" w:cs="Cambria" w:eastAsia="Cambria" w:hAnsi="Cambria"/>
-                <w:b w:val="false"/>
-                <w:bCs w:val="false"/>
-                <w:i w:val="false"/>
-                <w:iCs w:val="false"/>
-                <w:caps w:val="false"/>
-                <w:color w:val="333333"/>
-                <w:sz w:val="20"/>
-                <w:szCs w:val="20"/>
-              </w:rPr>
-              <w:t xml:space="preserve">28.5</w:t>
-            </w:r>
-          </w:p>
-        </w:tc>
-      </w:tr>
-    </w:tbl>
-    <w:p>
-      <w:pPr>
-        <w:spacing w:after="120"/>
-      </w:pPr>
+        <w:t xml:space="preserve">Week 1 §4.2 warned that signal-dependent noise penalizes the large commands a singularity demands. The channel shows how. Split the hand acceleration that G produces into a radial part, along the line from shoulder to hand, and a tangential part across it. For torque noise of equal size at both joints, the radial gain stays between 5.6 and 6.1 m/s² per N·m from θ₂ = 90° to 40°, then falls toward zero; below about 8° it falls in proportion to det(J) = l₁l₂ sin θ₂ from Week 1. The tangential gain rises from 5.0 to 14.3 and changes little over the last few degrees (Figure 4C).</w:t>
+      </w:r>
     </w:p>
     <w:p>
       <w:pPr>
@@ -14433,7 +13211,7 @@
           <w:sz w:val="22"/>
           <w:szCs w:val="22"/>
         </w:rPr>
-        <w:t xml:space="preserve">The gains are hand acceleration per unit joint torque (m/s² per N·m). As the elbow straightens, the radial gain falls toward zero in proportion to det(J) = l₁l₂ sin θ₂ from Week 1. Below about 15° the ratio of radial gain to det(J) stays within 8% of constant. The tangential gain levels off near 14 (Figure 4C). At θ₂ = 2° the channel responds 29 times more strongly across the arm than along it.</w:t>
+        <w:t xml:space="preserve">For example, from θ₂ = 8° to 2°, det(J) falls from 0.0218 to 0.0055 m², 4.0 times smaller, and the radial gain falls from 1.95 to 0.50 m/s² per N·m, 3.9 times smaller. The tangential gain changes by 2% (13.95 to 14.29).</w:t>
       </w:r>
     </w:p>
     <w:p>
@@ -14453,7 +13231,7 @@
           <w:sz w:val="22"/>
           <w:szCs w:val="22"/>
         </w:rPr>
-        <w:t xml:space="preserve">Near full extension, then, the hand becomes less sensitive to noise along the arm, not more. Torque at the joints cannot move the hand radially there. For the same reason, commands cannot move it radially either: Week 1’s manipulability ellipsoid and this noise ellipse flatten together, because both are governed by det(J). Reduced noise in the radial direction therefore does not increase the number of positions the hand can distinguish along the arm, because the range of radial movement shrinks at the same rate.</w:t>
+        <w:t xml:space="preserve">With the noise of Equation 7.4 the picture changes, because the noise follows the command. Accelerating the hand from rest along the arm at 1 m/s² takes 0.47 N·m of torque at θ₂ = 90° but 17.8 N·m at 2°, because the torque grows as 1/det(J). The extra noise this torque carries offsets the smaller radial gain, so the noise along the arm does not fall: it rises from 0.11 to 0.48 m/s². Across the arm, where the gain does not fall, it grows from 0.086 to 10.6 m/s², 123 times larger. This is the penalty Week 1 described.</w:t>
       </w:r>
     </w:p>
     <w:p>
@@ -14534,7 +13312,7 @@
           <w:sz w:val="19"/>
           <w:szCs w:val="19"/>
         </w:rPr>
-        <w:t xml:space="preserve">From joint torque to hand position. A: 2-SD endpoint ellipses at the standard reach, from the Monte Carlo simulation (solid) and from Equation 7.8 (dashed), drawn four times actual size around each target so that they are visible. B: predicted against measured aspect ratio, r = 0.994. C: channel gain as the elbow straightens toward the Week 1 singularity. The radial gain falls in proportion to det(J); the tangential gain levels off.</w:t>
+        <w:t xml:space="preserve">From joint torque to hand position. A: 2-SD endpoint ellipses at the standard reach, from the Monte Carlo simulation (solid) and from Equation 7.8 (dashed), drawn four times actual size around each target so that they are visible. B: predicted against measured aspect ratio, r = 0.994. C: channel gain as the elbow straightens toward the Week 1 singularity. The radial gain holds near 6 down to about 40° and then falls, in proportion to det(J) near full extension; the tangential gain rises and flattens only in the last few degrees.</w:t>
       </w:r>
     </w:p>
     <w:p>
@@ -15599,7 +14377,36 @@
                 <w:sz w:val="21"/>
                 <w:szCs w:val="21"/>
               </w:rPr>
-              <w:t xml:space="preserve">1. Each 10 ms noise sample is a torque perturbation of size k|⁠τ|. Since |⁠τ| ∝ 1/T², the velocity error each sample causes is proportional to 1/T².</w:t>
+              <w:t xml:space="preserve">1. Each 10 ms noise sample is a torque perturbation of size k|⁠τ|. Since |⁠τ| ∝ 1/T², the velocity error each sample causes is proportional to 1/T², and its variance to (1/T²)² = T</w:t>
+            </w:r>
+            <w:r>
+              <w:rPr>
+                <w:rFonts w:ascii="Cambria" w:cs="Cambria" w:eastAsia="Cambria" w:hAnsi="Cambria"/>
+                <w:b w:val="false"/>
+                <w:bCs w:val="false"/>
+                <w:i w:val="false"/>
+                <w:iCs w:val="false"/>
+                <w:caps w:val="false"/>
+                <w:color w:val="333333"/>
+                <w:sz w:val="21"/>
+                <w:szCs w:val="21"/>
+                <w:vertAlign w:val="superscript"/>
+              </w:rPr>
+              <w:t xml:space="preserve">−4</w:t>
+            </w:r>
+            <w:r>
+              <w:rPr>
+                <w:rFonts w:ascii="Cambria" w:cs="Cambria" w:eastAsia="Cambria" w:hAnsi="Cambria"/>
+                <w:b w:val="false"/>
+                <w:bCs w:val="false"/>
+                <w:i w:val="false"/>
+                <w:iCs w:val="false"/>
+                <w:caps w:val="false"/>
+                <w:color w:val="333333"/>
+                <w:sz w:val="21"/>
+                <w:szCs w:val="21"/>
+              </w:rPr>
+              <w:t xml:space="preserve">.</w:t>
             </w:r>
           </w:p>
         </w:tc>
@@ -15636,7 +14443,65 @@
                 <w:sz w:val="21"/>
                 <w:szCs w:val="21"/>
               </w:rPr>
-              <w:t xml:space="preserve">2. The samples are independent and there are T/T_C of them, so the variance of the accumulated velocity error grows as (1/T²)² × T.</w:t>
+              <w:t xml:space="preserve">2. The samples are independent, so their variances add. There are T/T_C of them, a number proportional to T because T_C is fixed, so the variance of the summed velocity error is proportional to T</w:t>
+            </w:r>
+            <w:r>
+              <w:rPr>
+                <w:rFonts w:ascii="Cambria" w:cs="Cambria" w:eastAsia="Cambria" w:hAnsi="Cambria"/>
+                <w:b w:val="false"/>
+                <w:bCs w:val="false"/>
+                <w:i w:val="false"/>
+                <w:iCs w:val="false"/>
+                <w:caps w:val="false"/>
+                <w:color w:val="333333"/>
+                <w:sz w:val="21"/>
+                <w:szCs w:val="21"/>
+                <w:vertAlign w:val="superscript"/>
+              </w:rPr>
+              <w:t xml:space="preserve">−4</w:t>
+            </w:r>
+            <w:r>
+              <w:rPr>
+                <w:rFonts w:ascii="Cambria" w:cs="Cambria" w:eastAsia="Cambria" w:hAnsi="Cambria"/>
+                <w:b w:val="false"/>
+                <w:bCs w:val="false"/>
+                <w:i w:val="false"/>
+                <w:iCs w:val="false"/>
+                <w:caps w:val="false"/>
+                <w:color w:val="333333"/>
+                <w:sz w:val="21"/>
+                <w:szCs w:val="21"/>
+              </w:rPr>
+              <w:t xml:space="preserve"> × T = T</w:t>
+            </w:r>
+            <w:r>
+              <w:rPr>
+                <w:rFonts w:ascii="Cambria" w:cs="Cambria" w:eastAsia="Cambria" w:hAnsi="Cambria"/>
+                <w:b w:val="false"/>
+                <w:bCs w:val="false"/>
+                <w:i w:val="false"/>
+                <w:iCs w:val="false"/>
+                <w:caps w:val="false"/>
+                <w:color w:val="333333"/>
+                <w:sz w:val="21"/>
+                <w:szCs w:val="21"/>
+                <w:vertAlign w:val="superscript"/>
+              </w:rPr>
+              <w:t xml:space="preserve">−3</w:t>
+            </w:r>
+            <w:r>
+              <w:rPr>
+                <w:rFonts w:ascii="Cambria" w:cs="Cambria" w:eastAsia="Cambria" w:hAnsi="Cambria"/>
+                <w:b w:val="false"/>
+                <w:bCs w:val="false"/>
+                <w:i w:val="false"/>
+                <w:iCs w:val="false"/>
+                <w:caps w:val="false"/>
+                <w:color w:val="333333"/>
+                <w:sz w:val="21"/>
+                <w:szCs w:val="21"/>
+              </w:rPr>
+              <w:t xml:space="preserve">.</w:t>
             </w:r>
           </w:p>
         </w:tc>
@@ -15673,7 +14538,65 @@
                 <w:sz w:val="21"/>
                 <w:szCs w:val="21"/>
               </w:rPr>
-              <w:t xml:space="preserve">3. A velocity error made during the movement moves the hand for the remaining time, which is proportional to T. This multiplies the position variance by T².</w:t>
+              <w:t xml:space="preserve">3. A velocity error made during the movement moves the hand for the remaining time, which is proportional to T. A position error is a velocity error times a time, so the position variance is multiplied by T²: T</w:t>
+            </w:r>
+            <w:r>
+              <w:rPr>
+                <w:rFonts w:ascii="Cambria" w:cs="Cambria" w:eastAsia="Cambria" w:hAnsi="Cambria"/>
+                <w:b w:val="false"/>
+                <w:bCs w:val="false"/>
+                <w:i w:val="false"/>
+                <w:iCs w:val="false"/>
+                <w:caps w:val="false"/>
+                <w:color w:val="333333"/>
+                <w:sz w:val="21"/>
+                <w:szCs w:val="21"/>
+                <w:vertAlign w:val="superscript"/>
+              </w:rPr>
+              <w:t xml:space="preserve">−3</w:t>
+            </w:r>
+            <w:r>
+              <w:rPr>
+                <w:rFonts w:ascii="Cambria" w:cs="Cambria" w:eastAsia="Cambria" w:hAnsi="Cambria"/>
+                <w:b w:val="false"/>
+                <w:bCs w:val="false"/>
+                <w:i w:val="false"/>
+                <w:iCs w:val="false"/>
+                <w:caps w:val="false"/>
+                <w:color w:val="333333"/>
+                <w:sz w:val="21"/>
+                <w:szCs w:val="21"/>
+              </w:rPr>
+              <w:t xml:space="preserve"> × T² = T</w:t>
+            </w:r>
+            <w:r>
+              <w:rPr>
+                <w:rFonts w:ascii="Cambria" w:cs="Cambria" w:eastAsia="Cambria" w:hAnsi="Cambria"/>
+                <w:b w:val="false"/>
+                <w:bCs w:val="false"/>
+                <w:i w:val="false"/>
+                <w:iCs w:val="false"/>
+                <w:caps w:val="false"/>
+                <w:color w:val="333333"/>
+                <w:sz w:val="21"/>
+                <w:szCs w:val="21"/>
+                <w:vertAlign w:val="superscript"/>
+              </w:rPr>
+              <w:t xml:space="preserve">−1</w:t>
+            </w:r>
+            <w:r>
+              <w:rPr>
+                <w:rFonts w:ascii="Cambria" w:cs="Cambria" w:eastAsia="Cambria" w:hAnsi="Cambria"/>
+                <w:b w:val="false"/>
+                <w:bCs w:val="false"/>
+                <w:i w:val="false"/>
+                <w:iCs w:val="false"/>
+                <w:caps w:val="false"/>
+                <w:color w:val="333333"/>
+                <w:sz w:val="21"/>
+                <w:szCs w:val="21"/>
+              </w:rPr>
+              <w:t xml:space="preserve">.</w:t>
             </w:r>
           </w:p>
         </w:tc>
@@ -15710,7 +14633,65 @@
                 <w:sz w:val="21"/>
                 <w:szCs w:val="21"/>
               </w:rPr>
-              <w:t xml:space="preserve">4. Combining: variance ∝ T⁻⁴ · T · T² = T⁻¹, so SD ∝ T⁻¹ᐟ².</w:t>
+              <w:t xml:space="preserve">4. The endpoint variance is therefore proportional to T</w:t>
+            </w:r>
+            <w:r>
+              <w:rPr>
+                <w:rFonts w:ascii="Cambria" w:cs="Cambria" w:eastAsia="Cambria" w:hAnsi="Cambria"/>
+                <w:b w:val="false"/>
+                <w:bCs w:val="false"/>
+                <w:i w:val="false"/>
+                <w:iCs w:val="false"/>
+                <w:caps w:val="false"/>
+                <w:color w:val="333333"/>
+                <w:sz w:val="21"/>
+                <w:szCs w:val="21"/>
+                <w:vertAlign w:val="superscript"/>
+              </w:rPr>
+              <w:t xml:space="preserve">−1</w:t>
+            </w:r>
+            <w:r>
+              <w:rPr>
+                <w:rFonts w:ascii="Cambria" w:cs="Cambria" w:eastAsia="Cambria" w:hAnsi="Cambria"/>
+                <w:b w:val="false"/>
+                <w:bCs w:val="false"/>
+                <w:i w:val="false"/>
+                <w:iCs w:val="false"/>
+                <w:caps w:val="false"/>
+                <w:color w:val="333333"/>
+                <w:sz w:val="21"/>
+                <w:szCs w:val="21"/>
+              </w:rPr>
+              <w:t xml:space="preserve">, and the SD to T</w:t>
+            </w:r>
+            <w:r>
+              <w:rPr>
+                <w:rFonts w:ascii="Cambria" w:cs="Cambria" w:eastAsia="Cambria" w:hAnsi="Cambria"/>
+                <w:b w:val="false"/>
+                <w:bCs w:val="false"/>
+                <w:i w:val="false"/>
+                <w:iCs w:val="false"/>
+                <w:caps w:val="false"/>
+                <w:color w:val="333333"/>
+                <w:sz w:val="21"/>
+                <w:szCs w:val="21"/>
+                <w:vertAlign w:val="superscript"/>
+              </w:rPr>
+              <w:t xml:space="preserve">−1/2</w:t>
+            </w:r>
+            <w:r>
+              <w:rPr>
+                <w:rFonts w:ascii="Cambria" w:cs="Cambria" w:eastAsia="Cambria" w:hAnsi="Cambria"/>
+                <w:b w:val="false"/>
+                <w:bCs w:val="false"/>
+                <w:i w:val="false"/>
+                <w:iCs w:val="false"/>
+                <w:caps w:val="false"/>
+                <w:color w:val="333333"/>
+                <w:sz w:val="21"/>
+                <w:szCs w:val="21"/>
+              </w:rPr>
+              <w:t xml:space="preserve">.</w:t>
             </w:r>
           </w:p>
         </w:tc>
@@ -15726,6 +14707,43 @@
             <w:tcMar>
               <w:top w:type="dxa" w:w="0"/>
               <w:left w:type="dxa" w:w="200"/>
+              <w:bottom w:type="dxa" w:w="90"/>
+              <w:right w:type="dxa" w:w="200"/>
+            </w:tcMar>
+          </w:tcPr>
+          <w:p>
+            <w:pPr>
+              <w:keepNext w:val="false"/>
+              <w:spacing w:after="0" w:line="276"/>
+            </w:pPr>
+            <w:r>
+              <w:rPr>
+                <w:rFonts w:ascii="Cambria" w:cs="Cambria" w:eastAsia="Cambria" w:hAnsi="Cambria"/>
+                <w:b w:val="false"/>
+                <w:bCs w:val="false"/>
+                <w:i w:val="false"/>
+                <w:iCs w:val="false"/>
+                <w:caps w:val="false"/>
+                <w:color w:val="333333"/>
+                <w:sz w:val="21"/>
+                <w:szCs w:val="21"/>
+              </w:rPr>
+              <w:t xml:space="preserve">For example, double the movement time from 500 to 1000 ms. The torque falls to ¼, so each sample adds 1/16 as much velocity variance (step 1). There are 100 samples instead of 50, so the velocity variance falls to 2/16 = 1/8 (step 2). Each error then acts for twice as long, which multiplies the position variance by 4 (step 3). The endpoint variance halves, and the SD falls by 1/√2 = 0.71. The table above gives 0.445 cm at 500 ms and 0.320 cm at 1000 ms, a ratio of 0.72.</w:t>
+            </w:r>
+          </w:p>
+        </w:tc>
+      </w:tr>
+      <w:tr>
+        <w:trPr>
+          <w:cantSplit/>
+        </w:trPr>
+        <w:tc>
+          <w:tcPr>
+            <w:tcW w:type="dxa" w:w="9360"/>
+            <w:shd w:fill="E8F1F8" w:color="auto" w:val="clear"/>
+            <w:tcMar>
+              <w:top w:type="dxa" w:w="0"/>
+              <w:left w:type="dxa" w:w="200"/>
               <w:bottom w:type="dxa" w:w="150"/>
               <w:right w:type="dxa" w:w="200"/>
             </w:tcMar>
@@ -15780,7 +14798,7 @@
     </w:p>
     <w:p>
       <w:pPr>
-        <w:keepNext w:val="false"/>
+        <w:keepNext/>
         <w:spacing w:after="140" w:before="0" w:line="276"/>
       </w:pPr>
       <w:r>
@@ -15795,7 +14813,65 @@
           <w:sz w:val="22"/>
           <w:szCs w:val="22"/>
         </w:rPr>
-        <w:t xml:space="preserve">The number of bits is log₂(2D/W) for the smallest target the reach can hit, and that width is proportional to the endpoint SD. Substituting SD ∝ T⁻¹ᐟ² gives</w:t>
+        <w:t xml:space="preserve">The bits a reach delivers are log₂(2D/W) for the smallest target it hits on 95% of trials. The shape of the endpoint cloud does not change with T, so that width is proportional to the endpoint SD: W = c × SD, with c ≈ 3.5 for a round cloud (§2.2). Write the SD at any movement time as SD = s₀ (T/T₀)</w:t>
+      </w:r>
+      <w:r>
+        <w:rPr>
+          <w:rFonts w:ascii="Cambria" w:cs="Cambria" w:eastAsia="Cambria" w:hAnsi="Cambria"/>
+          <w:b w:val="false"/>
+          <w:bCs w:val="false"/>
+          <w:i w:val="false"/>
+          <w:iCs w:val="false"/>
+          <w:caps w:val="false"/>
+          <w:color w:val="333333"/>
+          <w:sz w:val="22"/>
+          <w:szCs w:val="22"/>
+          <w:vertAlign w:val="superscript"/>
+        </w:rPr>
+        <w:t xml:space="preserve">−1/2</w:t>
+      </w:r>
+      <w:r>
+        <w:rPr>
+          <w:rFonts w:ascii="Cambria" w:cs="Cambria" w:eastAsia="Cambria" w:hAnsi="Cambria"/>
+          <w:b w:val="false"/>
+          <w:bCs w:val="false"/>
+          <w:i w:val="false"/>
+          <w:iCs w:val="false"/>
+          <w:caps w:val="false"/>
+          <w:color w:val="333333"/>
+          <w:sz w:val="22"/>
+          <w:szCs w:val="22"/>
+        </w:rPr>
+        <w:t xml:space="preserve">, where s₀ is the SD at a reference time T₀. Then 2D/W = (2D / c s₀) × (T/T₀)</w:t>
+      </w:r>
+      <w:r>
+        <w:rPr>
+          <w:rFonts w:ascii="Cambria" w:cs="Cambria" w:eastAsia="Cambria" w:hAnsi="Cambria"/>
+          <w:b w:val="false"/>
+          <w:bCs w:val="false"/>
+          <w:i w:val="false"/>
+          <w:iCs w:val="false"/>
+          <w:caps w:val="false"/>
+          <w:color w:val="333333"/>
+          <w:sz w:val="22"/>
+          <w:szCs w:val="22"/>
+          <w:vertAlign w:val="superscript"/>
+        </w:rPr>
+        <w:t xml:space="preserve">1/2</w:t>
+      </w:r>
+      <w:r>
+        <w:rPr>
+          <w:rFonts w:ascii="Cambria" w:cs="Cambria" w:eastAsia="Cambria" w:hAnsi="Cambria"/>
+          <w:b w:val="false"/>
+          <w:bCs w:val="false"/>
+          <w:i w:val="false"/>
+          <w:iCs w:val="false"/>
+          <w:caps w:val="false"/>
+          <w:color w:val="333333"/>
+          <w:sz w:val="22"/>
+          <w:szCs w:val="22"/>
+        </w:rPr>
+        <w:t xml:space="preserve">, and taking log₂ of both sides gives</w:t>
       </w:r>
     </w:p>
     <w:p>
@@ -15818,6 +14894,49 @@
           <w:sz w:val="24"/>
           <w:szCs w:val="24"/>
         </w:rPr>
+        <w:t xml:space="preserve">bits(T)  =  log₂(2D / c s₀)  +  ½ · log₂(T / T₀)</w:t>
+      </w:r>
+    </w:p>
+    <w:p>
+      <w:pPr>
+        <w:keepNext/>
+        <w:spacing w:after="140" w:before="0" w:line="276"/>
+      </w:pPr>
+      <w:r>
+        <w:rPr>
+          <w:rFonts w:ascii="Cambria" w:cs="Cambria" w:eastAsia="Cambria" w:hAnsi="Cambria"/>
+          <w:b w:val="false"/>
+          <w:bCs w:val="false"/>
+          <w:i w:val="false"/>
+          <w:iCs w:val="false"/>
+          <w:caps w:val="false"/>
+          <w:color w:val="333333"/>
+          <w:sz w:val="22"/>
+          <w:szCs w:val="22"/>
+        </w:rPr>
+        <w:t xml:space="preserve">The first term does not depend on the movement time, so</w:t>
+      </w:r>
+    </w:p>
+    <w:p>
+      <w:pPr>
+        <w:tabs>
+          <w:tab w:val="right" w:pos="9026"/>
+        </w:tabs>
+        <w:spacing w:after="150" w:before="120"/>
+        <w:ind w:left="360"/>
+      </w:pPr>
+      <w:r>
+        <w:rPr>
+          <w:rFonts w:ascii="Cambria" w:cs="Cambria" w:eastAsia="Cambria" w:hAnsi="Cambria"/>
+          <w:b w:val="false"/>
+          <w:bCs w:val="false"/>
+          <w:i w:val="false"/>
+          <w:iCs w:val="false"/>
+          <w:caps w:val="false"/>
+          <w:color w:val="333333"/>
+          <w:sz w:val="24"/>
+          <w:szCs w:val="24"/>
+        </w:rPr>
         <w:t xml:space="preserve">bits(T)  =  constant  +  ½ · log₂ T</w:t>
       </w:r>
       <w:r>
@@ -15848,7 +14967,7 @@
           <w:sz w:val="22"/>
           <w:szCs w:val="22"/>
         </w:rPr>
-        <w:t xml:space="preserve">so each doubling of the movement time should add half a bit. This is the half bit of Equation 7.3. Doubling the movement time halves the variance of the endpoints while the distance, which plays the role of the signal, stays the same, so the signal-to-noise ratio doubles. The measured value, averaged over the eight directions, is 0.50 bits per doubling. The table and Figure 5C show it directly: 3.30 bits at 500 ms, 3.78 at 1000 ms and 4.29 at 2000 ms.</w:t>
+        <w:t xml:space="preserve">and doubling T adds ½ · log₂ 2 = ½ bit. This is the half bit of Equation 7.3. Doubling the movement time halves the variance of the endpoints while the distance, which plays the role of the signal, stays the same, so the signal-to-noise ratio doubles. The measured value, averaged over the eight directions, is 0.50 bits per doubling. The table and Figure 5C show it directly: 3.30 bits at 500 ms, 3.78 at 1000 ms (0.48 more) and 4.29 at 2000 ms (0.51 more).</w:t>
       </w:r>
     </w:p>
     <w:p>
@@ -15880,7 +14999,7 @@
       <w:r>
         <w:drawing>
           <wp:inline distT="0" distB="0" distL="0" distR="0">
-            <wp:extent cx="5715000" cy="1800225"/>
+            <wp:extent cx="5715000" cy="1762125"/>
             <wp:effectExtent t="0" r="0" b="0" l="0"/>
             <wp:docPr id="1" name="" descr="" title=""/>
             <wp:cNvGraphicFramePr>
@@ -15905,7 +15024,7 @@
                   <pic:spPr bwMode="auto">
                     <a:xfrm>
                       <a:off x="0" y="0"/>
-                      <a:ext cx="5715000" cy="1800225"/>
+                      <a:ext cx="5715000" cy="1762125"/>
                     </a:xfrm>
                     <a:prstGeom prst="rect">
                       <a:avLst/>
@@ -16316,7 +15435,7 @@
           </w:tcPr>
           <w:p>
             <w:pPr>
-              <w:keepNext/>
+              <w:keepNext w:val="false"/>
               <w:spacing w:after="0"/>
             </w:pPr>
             <w:r>
@@ -16348,7 +15467,7 @@
           </w:tcPr>
           <w:p>
             <w:pPr>
-              <w:keepNext/>
+              <w:keepNext w:val="false"/>
               <w:spacing w:after="0"/>
             </w:pPr>
             <w:r>
@@ -16380,7 +15499,7 @@
           </w:tcPr>
           <w:p>
             <w:pPr>
-              <w:keepNext/>
+              <w:keepNext w:val="false"/>
               <w:spacing w:after="0"/>
             </w:pPr>
             <w:r>
@@ -16412,7 +15531,7 @@
           </w:tcPr>
           <w:p>
             <w:pPr>
-              <w:keepNext/>
+              <w:keepNext w:val="false"/>
               <w:spacing w:after="0"/>
             </w:pPr>
             <w:r>
@@ -16584,7 +15703,7 @@
           </w:tcPr>
           <w:p>
             <w:pPr>
-              <w:keepNext/>
+              <w:keepNext w:val="false"/>
               <w:spacing w:after="0"/>
             </w:pPr>
             <w:r>
@@ -16616,7 +15735,7 @@
           </w:tcPr>
           <w:p>
             <w:pPr>
-              <w:keepNext/>
+              <w:keepNext w:val="false"/>
               <w:spacing w:after="0"/>
             </w:pPr>
             <w:r>
@@ -16648,7 +15767,7 @@
           </w:tcPr>
           <w:p>
             <w:pPr>
-              <w:keepNext/>
+              <w:keepNext w:val="false"/>
               <w:spacing w:after="0"/>
             </w:pPr>
             <w:r>
@@ -16680,7 +15799,7 @@
           </w:tcPr>
           <w:p>
             <w:pPr>
-              <w:keepNext/>
+              <w:keepNext w:val="false"/>
               <w:spacing w:after="0"/>
             </w:pPr>
             <w:r>
@@ -16852,7 +15971,7 @@
           </w:tcPr>
           <w:p>
             <w:pPr>
-              <w:keepNext/>
+              <w:keepNext w:val="false"/>
               <w:spacing w:after="0"/>
             </w:pPr>
             <w:r>
@@ -16884,7 +16003,7 @@
           </w:tcPr>
           <w:p>
             <w:pPr>
-              <w:keepNext/>
+              <w:keepNext w:val="false"/>
               <w:spacing w:after="0"/>
             </w:pPr>
             <w:r>
@@ -16916,7 +16035,7 @@
           </w:tcPr>
           <w:p>
             <w:pPr>
-              <w:keepNext/>
+              <w:keepNext w:val="false"/>
               <w:spacing w:after="0"/>
             </w:pPr>
             <w:r>
@@ -16948,7 +16067,7 @@
           </w:tcPr>
           <w:p>
             <w:pPr>
-              <w:keepNext/>
+              <w:keepNext w:val="false"/>
               <w:spacing w:after="0"/>
             </w:pPr>
             <w:r>
@@ -17622,7 +16741,7 @@
           <w:sz w:val="22"/>
           <w:szCs w:val="22"/>
         </w:rPr>
-        <w:t xml:space="preserve">The model disagrees with Equation 7.10 in three ways.</w:t>
+        <w:t xml:space="preserve">The feedforward model of §4 and §5, which plans each reach in advance and never corrects it, disagrees with Equation 7.10 in three ways.</w:t>
       </w:r>
     </w:p>
     <w:p>
@@ -17642,7 +16761,50 @@
           <w:sz w:val="22"/>
           <w:szCs w:val="22"/>
         </w:rPr>
-        <w:t xml:space="preserve">The first is the shape of the relationship. A power law in W is not a logarithm in W, and over the range tested the two can be told apart. Fitting the model’s results with a straight line in ID gives r = 0.9753, compared with r = 0.9999 for the power law. The residuals from the straight line are not random: they form a U, positive at both ends and negative in the middle (Figure 6C). That pattern is what remains when a straight line is fitted to a curve.</w:t>
+        <w:t xml:space="preserve">The first is the shape of the relationship. The model’s minimum movement time follows the power law of §5, MT ∝ </w:t>
+      </w:r>
+      <w:r>
+        <w:rPr>
+          <w:rFonts w:ascii="Cambria" w:cs="Cambria" w:eastAsia="Cambria" w:hAnsi="Cambria"/>
+          <w:b w:val="false"/>
+          <w:bCs w:val="false"/>
+          <w:i w:val="false"/>
+          <w:iCs w:val="false"/>
+          <w:caps w:val="false"/>
+          <w:color w:val="333333"/>
+          <w:sz w:val="22"/>
+          <w:szCs w:val="22"/>
+        </w:rPr>
+        <w:t xml:space="preserve">W</w:t>
+      </w:r>
+      <w:r>
+        <w:rPr>
+          <w:rFonts w:ascii="Cambria" w:cs="Cambria" w:eastAsia="Cambria" w:hAnsi="Cambria"/>
+          <w:b w:val="false"/>
+          <w:bCs w:val="false"/>
+          <w:i w:val="false"/>
+          <w:iCs w:val="false"/>
+          <w:caps w:val="false"/>
+          <w:color w:val="333333"/>
+          <w:sz w:val="22"/>
+          <w:szCs w:val="22"/>
+          <w:vertAlign w:val="superscript"/>
+        </w:rPr>
+        <w:t xml:space="preserve">−2.02</w:t>
+      </w:r>
+      <w:r>
+        <w:rPr>
+          <w:rFonts w:ascii="Cambria" w:cs="Cambria" w:eastAsia="Cambria" w:hAnsi="Cambria"/>
+          <w:b w:val="false"/>
+          <w:bCs w:val="false"/>
+          <w:i w:val="false"/>
+          <w:iCs w:val="false"/>
+          <w:caps w:val="false"/>
+          <w:color w:val="333333"/>
+          <w:sz w:val="22"/>
+          <w:szCs w:val="22"/>
+        </w:rPr>
+        <w:t xml:space="preserve">, and Equation 7.10 is a logarithm in W. Halving W adds one bit, so under Equation 7.10 it always adds the same b ms. Under the power law it multiplies MT by about 4, so the time added depends on where you start: from 24 to 12 mm the model’s MT rises by 762 ms, from 20 to 10 mm by 1104 ms (§5 table). Over these widths, 10 to 24 mm or 2.7 to 4.0 bits, fitting a straight line in ID gives r = 0.9753, compared with r = 0.9999 for the power law. The residuals from the straight line are not random: they form a U, positive at both ends and negative in the middle (Figure 6C). That pattern is what remains when a straight line is fitted to a curve.</w:t>
       </w:r>
     </w:p>
     <w:p>
@@ -17769,7 +16931,36 @@
                 <w:sz w:val="21"/>
                 <w:szCs w:val="21"/>
               </w:rPr>
-              <w:t xml:space="preserve">A common shortcut goes: endpoint SD scales as a power of T; require SD &lt; W/4; solve for T; conclude Fitts’ law. The conclusion does not follow, as §5 shows. Solving a power law for T gives another power law, here MT ∝ W⁻², and a power law is not a logarithm.</w:t>
+              <w:t xml:space="preserve">A common shortcut goes: endpoint SD scales as a power of T; require SD &lt; W/4; solve for T; conclude Fitts’ law. The conclusion does not follow, as §5 shows. Solving a power law for T gives another power law, here MT ∝ W</w:t>
+            </w:r>
+            <w:r>
+              <w:rPr>
+                <w:rFonts w:ascii="Cambria" w:cs="Cambria" w:eastAsia="Cambria" w:hAnsi="Cambria"/>
+                <w:b w:val="false"/>
+                <w:bCs w:val="false"/>
+                <w:i w:val="false"/>
+                <w:iCs w:val="false"/>
+                <w:caps w:val="false"/>
+                <w:color w:val="333333"/>
+                <w:sz w:val="21"/>
+                <w:szCs w:val="21"/>
+                <w:vertAlign w:val="superscript"/>
+              </w:rPr>
+              <w:t xml:space="preserve">−2</w:t>
+            </w:r>
+            <w:r>
+              <w:rPr>
+                <w:rFonts w:ascii="Cambria" w:cs="Cambria" w:eastAsia="Cambria" w:hAnsi="Cambria"/>
+                <w:b w:val="false"/>
+                <w:bCs w:val="false"/>
+                <w:i w:val="false"/>
+                <w:iCs w:val="false"/>
+                <w:caps w:val="false"/>
+                <w:color w:val="333333"/>
+                <w:sz w:val="21"/>
+                <w:szCs w:val="21"/>
+              </w:rPr>
+              <w:t xml:space="preserve">, and a power law is not a logarithm.</w:t>
             </w:r>
           </w:p>
         </w:tc>
@@ -17806,7 +16997,7 @@
                 <w:sz w:val="21"/>
                 <w:szCs w:val="21"/>
               </w:rPr>
-              <w:t xml:space="preserve">Over a narrow range of D/W the two curves can look similar, which is why the shortcut appears in summaries of the literature. Over the three bits tested here they are clearly different.</w:t>
+              <w:t xml:space="preserve">Over a narrow range of D/W the two curves can look similar, which is why the shortcut appears in summaries of the literature. Over the 1.3 bits fitted here (10 to 24 mm) they are already clearly different.</w:t>
             </w:r>
           </w:p>
         </w:tc>
@@ -18494,7 +17685,65 @@
           <w:sz w:val="22"/>
           <w:szCs w:val="22"/>
         </w:rPr>
-        <w:t xml:space="preserve">Across a fourfold range of k the fitted exponent stays near −2. Changing k moves the curve up or down, because it changes how accurate the arm is at every speed, but it does not change the slope (Figure 7C). This follows from Equation 7.9: setting SD ∝ k T⁻¹ᐟ² proportional to W and solving gives MT ∝ k² W⁻², where k appears only as a constant factor. Even at k = 0.075, where the standard reach has an endpoint SD of 0.24 cm (more precise than people), the slope is far outside the human range. Adjusting k therefore cannot fix the disagreement with Fitts’ law.</w:t>
+        <w:t xml:space="preserve">Across a fourfold range of k the fitted exponent stays near −2. Changing k moves the curve up or down, because it changes how accurate the arm is at every speed, but it does not change the slope (Figure 7C). This follows from Equation 7.9: setting SD ∝ k T</w:t>
+      </w:r>
+      <w:r>
+        <w:rPr>
+          <w:rFonts w:ascii="Cambria" w:cs="Cambria" w:eastAsia="Cambria" w:hAnsi="Cambria"/>
+          <w:b w:val="false"/>
+          <w:bCs w:val="false"/>
+          <w:i w:val="false"/>
+          <w:iCs w:val="false"/>
+          <w:caps w:val="false"/>
+          <w:color w:val="333333"/>
+          <w:sz w:val="22"/>
+          <w:szCs w:val="22"/>
+          <w:vertAlign w:val="superscript"/>
+        </w:rPr>
+        <w:t xml:space="preserve">−1/2</w:t>
+      </w:r>
+      <w:r>
+        <w:rPr>
+          <w:rFonts w:ascii="Cambria" w:cs="Cambria" w:eastAsia="Cambria" w:hAnsi="Cambria"/>
+          <w:b w:val="false"/>
+          <w:bCs w:val="false"/>
+          <w:i w:val="false"/>
+          <w:iCs w:val="false"/>
+          <w:caps w:val="false"/>
+          <w:color w:val="333333"/>
+          <w:sz w:val="22"/>
+          <w:szCs w:val="22"/>
+        </w:rPr>
+        <w:t xml:space="preserve"> proportional to W and solving gives MT ∝ k² W</w:t>
+      </w:r>
+      <w:r>
+        <w:rPr>
+          <w:rFonts w:ascii="Cambria" w:cs="Cambria" w:eastAsia="Cambria" w:hAnsi="Cambria"/>
+          <w:b w:val="false"/>
+          <w:bCs w:val="false"/>
+          <w:i w:val="false"/>
+          <w:iCs w:val="false"/>
+          <w:caps w:val="false"/>
+          <w:color w:val="333333"/>
+          <w:sz w:val="22"/>
+          <w:szCs w:val="22"/>
+          <w:vertAlign w:val="superscript"/>
+        </w:rPr>
+        <w:t xml:space="preserve">−2</w:t>
+      </w:r>
+      <w:r>
+        <w:rPr>
+          <w:rFonts w:ascii="Cambria" w:cs="Cambria" w:eastAsia="Cambria" w:hAnsi="Cambria"/>
+          <w:b w:val="false"/>
+          <w:bCs w:val="false"/>
+          <w:i w:val="false"/>
+          <w:iCs w:val="false"/>
+          <w:caps w:val="false"/>
+          <w:color w:val="333333"/>
+          <w:sz w:val="22"/>
+          <w:szCs w:val="22"/>
+        </w:rPr>
+        <w:t xml:space="preserve">, where k appears only as a constant factor. Even at k = 0.075, where the standard reach has an endpoint SD of 0.24 cm (more precise than people), the slope is far outside the human range. Adjusting k therefore cannot fix the disagreement with Fitts’ law.</w:t>
       </w:r>
     </w:p>
     <w:p>
@@ -18784,7 +18033,27 @@
           <w:sz w:val="22"/>
           <w:szCs w:val="22"/>
         </w:rPr>
-        <w:t xml:space="preserve">Woodworth (1899) had people draw lines to a target with and without seeing their hand. The accurate movements were not single smooth motions. They consisted of a fast initial movement that covered most of the distance, followed by one or more slower corrections. The speed profile of an accurate reach is a large bell followed by smaller bumps.</w:t>
+        <w:t xml:space="preserve">Woodworth (1899) had people draw lines to a target with and without seeing their hand. The accurate movements were not single smooth motions. They consisted of a fast initial movement that covered most of the distance, followed by one or more slower corrections.</w:t>
+      </w:r>
+    </w:p>
+    <w:p>
+      <w:pPr>
+        <w:keepNext w:val="false"/>
+        <w:spacing w:after="140" w:before="0" w:line="276"/>
+      </w:pPr>
+      <w:r>
+        <w:rPr>
+          <w:rFonts w:ascii="Cambria" w:cs="Cambria" w:eastAsia="Cambria" w:hAnsi="Cambria"/>
+          <w:b w:val="false"/>
+          <w:bCs w:val="false"/>
+          <w:i w:val="false"/>
+          <w:iCs w:val="false"/>
+          <w:caps w:val="false"/>
+          <w:color w:val="333333"/>
+          <w:sz w:val="22"/>
+          <w:szCs w:val="22"/>
+        </w:rPr>
+        <w:t xml:space="preserve">The corrections need information the controller of §4 to §6 never had: where the hand is and how it is moving. Vision is not the only source. The participants of van Beers et al. (2004) could not see their arm, yet from about 250 ms into the reach their variance grew more slowly than their open-loop model predicted, and the authors conclude that any corrections must have been based on proprioceptive feedback (pp. 1057, 1061). Their corrections came during the reach. The ones modeled here come after it ends: the controller receives the hand’s position and velocity at the end of each movement, after a delay.</w:t>
       </w:r>
     </w:p>
     <w:p>
@@ -21230,7 +20499,7 @@
           <w:sz w:val="22"/>
           <w:szCs w:val="22"/>
         </w:rPr>
-        <w:t xml:space="preserve">Two limitations. First, the correcting controller senses position and velocity perfectly. Real proprioception and vision are noisy, which would make r larger and the slope steeper; Homework 7 measures how much. Second, a delay can do more than slow a controller down: Week 8 will show that acting on delayed information can make a controller unstable, which cannot happen in a model that corrects only between movements. The model therefore brackets human performance, but it does not yet explain it.</w:t>
+        <w:t xml:space="preserve">Three limitations. First, the correcting controller senses position and velocity perfectly. Real proprioception and vision are noisy, which would make r larger and the slope steeper; Homework 7 measures how much. Second, a delay can do more than slow a controller down: Week 8 will show that acting on delayed information can make a controller unstable, which cannot happen in a model that corrects only between movements. Third, vision helps movements too short for a correction of this kind: Zelaznik et al. (1983) found that seeing the hand improved accuracy at movement times as short as 120 ms (Exp. 2, p. 227), though not at 70 ms (Exp. 3, pp. 228–229), and attribute the benefit to processes other than intermittent correction (p. 217). The model therefore brackets human performance, but it does not yet explain it.</w:t>
       </w:r>
     </w:p>
     <w:p>
@@ -21250,7 +20519,7 @@
           <w:sz w:val="22"/>
           <w:szCs w:val="22"/>
         </w:rPr>
-        <w:t xml:space="preserve">The intermittent-correction account is not the only one. Meyer et al. (1988) proposed the main alternative, a stochastic optimized-submovement model with a primary movement and at most one correction.</w:t>
+        <w:t xml:space="preserve">Meyer et al. (1988) proposed the main alternative to this account: a stochastic optimized-submovement model with a primary movement and at most one correction.</w:t>
       </w:r>
     </w:p>
     <w:p>
@@ -21262,7 +20531,7 @@
       <w:r>
         <w:drawing>
           <wp:inline distT="0" distB="0" distL="0" distR="0">
-            <wp:extent cx="5715000" cy="1581150"/>
+            <wp:extent cx="5715000" cy="1485900"/>
             <wp:effectExtent t="0" r="0" b="0" l="0"/>
             <wp:docPr id="1" name="" descr="" title=""/>
             <wp:cNvGraphicFramePr>
@@ -21287,7 +20556,7 @@
                   <pic:spPr bwMode="auto">
                     <a:xfrm>
                       <a:off x="0" y="0"/>
-                      <a:ext cx="5715000" cy="1581150"/>
+                      <a:ext cx="5715000" cy="1485900"/>
                     </a:xfrm>
                     <a:prstGeom prst="rect">
                       <a:avLst/>
@@ -21471,7 +20740,7 @@
           <w:sz w:val="22"/>
           <w:szCs w:val="22"/>
         </w:rPr>
-        <w:t xml:space="preserve">The number of trials sets the precision of the result. Earlier weeks computed exact values. This week’s results are estimates from random samples, and each estimate has an error. A standard deviation computed from n trials has a standard error of about SD/√(2n): 1.6% at n = 2000 and 7% at n = 100. Figure 9B shows how much an estimate still moves at n = 100. Two conditions whose SDs differ by 3% at n = 200 have not been shown to differ. The SDs in these notes are printed to three decimal places, but at n = 2000 the third digit is within the standard error and should not be read as a result.</w:t>
+        <w:t xml:space="preserve">The number of trials sets the precision of the result. Earlier weeks computed exact values. This week’s results are estimates from random samples, and each estimate has an error. A standard deviation computed from n trials has a standard error of about SD/√(2n): 1.6% at n = 2000 and 7% at n = 100. Figure 9B shows how much an estimate still moves at n = 100. The SDs in these notes are printed to three decimal places, but at n = 2000 the third digit is within the standard error and should not be read as a result.</w:t>
       </w:r>
     </w:p>
     <w:p>
@@ -21491,7 +20760,7 @@
           <w:sz w:val="22"/>
           <w:szCs w:val="22"/>
         </w:rPr>
-        <w:t xml:space="preserve">Before comparing two estimates, compute their standard errors, and treat a difference smaller than about twice the standard error as no difference. Lab 07 Section A asks you to do this before any other results are reported.</w:t>
+        <w:t xml:space="preserve">Before comparing two estimates, compute their standard errors, and treat a difference smaller than about twice the standard error as no difference.</w:t>
       </w:r>
     </w:p>
     <w:p>
@@ -21503,7 +20772,7 @@
       <w:r>
         <w:drawing>
           <wp:inline distT="0" distB="0" distL="0" distR="0">
-            <wp:extent cx="5715000" cy="1343025"/>
+            <wp:extent cx="5715000" cy="1200150"/>
             <wp:effectExtent t="0" r="0" b="0" l="0"/>
             <wp:docPr id="1" name="" descr="" title=""/>
             <wp:cNvGraphicFramePr>
@@ -21528,7 +20797,7 @@
                   <pic:spPr bwMode="auto">
                     <a:xfrm>
                       <a:off x="0" y="0"/>
-                      <a:ext cx="5715000" cy="1343025"/>
+                      <a:ext cx="5715000" cy="1200150"/>
                     </a:xfrm>
                     <a:prstGeom prst="rect">
                       <a:avLst/>
@@ -22451,7 +21720,7 @@
           <w:sz w:val="22"/>
           <w:szCs w:val="22"/>
         </w:rPr>
-        <w:t xml:space="preserve">Signal-dependent noise gets one result right this week, a second only in part, and fails on a third. The endpoint scatter it produces can be computed directly from Week 1’s Jacobian and Week 3’s mass matrix. It is the type of noise that makes movement difficulty depend on the ratio of distance to target size, as Fitts found. It predicts that a sixfold difference in the torque needed for different reach directions produces less than a twofold difference in endpoint variability. People’s variability does not follow the torque either, but it is more even still: van Beers et al. found no significant difference across directions, and their most elongated scatter was less than half as elongated as the model’s.</w:t>
+        <w:t xml:space="preserve">Signal-dependent noise gets one result right this week, a second only in part, and fails on a third. It is the type of noise that makes movement difficulty depend on the ratio of distance to target size, as Fitts found. It predicts that a sixfold difference in the torque needed for different reach directions produces less than a twofold difference in endpoint variability. People’s variability does not follow the torque either, but it is more even still: van Beers et al. found no significant difference across directions, and their most elongated scatter was less than half as elongated as the model’s.</w:t>
       </w:r>
     </w:p>
     <w:p>

</xml_diff>